<commit_message>
feat: Implement AI services for data analysis, report suggestions, and template generation, add new template processing utilities, a report editor component, and comprehensive testing and deployment documentation.
</commit_message>
<xml_diff>
--- a/backend/templates/UGS.docx
+++ b/backend/templates/UGS.docx
@@ -2572,7 +2572,7 @@
         <mc:AlternateContent>
           <mc:Choice Requires="wps">
             <w:drawing>
-              <wp:anchor distT="0" distB="0" distL="0" distR="0" simplePos="0" relativeHeight="251658240" behindDoc="0" locked="0" layoutInCell="1" hidden="0" allowOverlap="1" wp14:anchorId="523111C5" wp14:editId="523111C6">
+              <wp:anchor distT="0" distB="0" distL="0" distR="0" simplePos="0" relativeHeight="251657216" behindDoc="0" locked="0" layoutInCell="1" hidden="0" allowOverlap="1" wp14:anchorId="523111C5" wp14:editId="1F804A37">
                 <wp:simplePos x="0" y="0"/>
                 <wp:positionH relativeFrom="column">
                   <wp:posOffset>891654</wp:posOffset>
@@ -2639,7 +2639,7 @@
           </mc:Choice>
           <mc:Fallback>
             <w:pict>
-              <v:shape w14:anchorId="350C8565" id="Freeform: Shape 2" o:spid="_x0000_s1026" style="position:absolute;margin-left:70.2pt;margin-top:14pt;width:453.7pt;height:2.2pt;z-index:251658240;visibility:visible;mso-wrap-style:square;mso-wrap-distance-left:0;mso-wrap-distance-top:0;mso-wrap-distance-right:0;mso-wrap-distance-bottom:0;mso-position-horizontal:absolute;mso-position-horizontal-relative:text;mso-position-vertical:absolute;mso-position-vertical-relative:text;v-text-anchor:middle" coordsize="5752465,18415" o:gfxdata="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" path="m5752465,l,,,18288r5752465,l5752465,xe" fillcolor="black" stroked="f">
+              <v:shape w14:anchorId="24286C88" id="Freeform: Shape 2" o:spid="_x0000_s1026" style="position:absolute;margin-left:70.2pt;margin-top:14pt;width:453.7pt;height:2.2pt;z-index:251657216;visibility:visible;mso-wrap-style:square;mso-wrap-distance-left:0;mso-wrap-distance-top:0;mso-wrap-distance-right:0;mso-wrap-distance-bottom:0;mso-position-horizontal:absolute;mso-position-horizontal-relative:text;mso-position-vertical:absolute;mso-position-vertical-relative:text;v-text-anchor:middle" coordsize="5752465,18415" o:gfxdata="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" path="m5752465,l,,,18288r5752465,l5752465,xe" fillcolor="black" stroked="f">
                 <v:path arrowok="t" o:extrusionok="f"/>
                 <w10:wrap type="topAndBottom"/>
               </v:shape>
@@ -4095,7 +4095,7 @@
         <mc:AlternateContent>
           <mc:Choice Requires="wps">
             <w:drawing>
-              <wp:anchor distT="0" distB="0" distL="0" distR="0" simplePos="0" relativeHeight="251659264" behindDoc="0" locked="0" layoutInCell="1" hidden="0" allowOverlap="1" wp14:anchorId="523111C7" wp14:editId="523111C8">
+              <wp:anchor distT="0" distB="0" distL="0" distR="0" simplePos="0" relativeHeight="251658240" behindDoc="0" locked="0" layoutInCell="1" hidden="0" allowOverlap="1" wp14:anchorId="523111C7" wp14:editId="17ABF387">
                 <wp:simplePos x="0" y="0"/>
                 <wp:positionH relativeFrom="column">
                   <wp:posOffset>891654</wp:posOffset>
@@ -4162,7 +4162,7 @@
           </mc:Choice>
           <mc:Fallback>
             <w:pict>
-              <v:shape w14:anchorId="0EF69C9D" id="Freeform: Shape 8" o:spid="_x0000_s1026" style="position:absolute;margin-left:70.2pt;margin-top:7pt;width:453.7pt;height:2.2pt;z-index:251659264;visibility:visible;mso-wrap-style:square;mso-wrap-distance-left:0;mso-wrap-distance-top:0;mso-wrap-distance-right:0;mso-wrap-distance-bottom:0;mso-position-horizontal:absolute;mso-position-horizontal-relative:text;mso-position-vertical:absolute;mso-position-vertical-relative:text;v-text-anchor:middle" coordsize="5752465,18415" o:gfxdata="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" path="m5752465,l,,,18288r5752465,l5752465,xe" fillcolor="black" stroked="f">
+              <v:shape w14:anchorId="460736A7" id="Freeform: Shape 8" o:spid="_x0000_s1026" style="position:absolute;margin-left:70.2pt;margin-top:7pt;width:453.7pt;height:2.2pt;z-index:251658240;visibility:visible;mso-wrap-style:square;mso-wrap-distance-left:0;mso-wrap-distance-top:0;mso-wrap-distance-right:0;mso-wrap-distance-bottom:0;mso-position-horizontal:absolute;mso-position-horizontal-relative:text;mso-position-vertical:absolute;mso-position-vertical-relative:text;v-text-anchor:middle" coordsize="5752465,18415" o:gfxdata="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" path="m5752465,l,,,18288r5752465,l5752465,xe" fillcolor="black" stroked="f">
                 <v:path arrowok="t" o:extrusionok="f"/>
                 <w10:wrap type="topAndBottom"/>
               </v:shape>
@@ -21266,1493 +21266,6 @@
           <w:szCs w:val="20"/>
         </w:rPr>
       </w:pPr>
-      <w:r>
-        <w:rPr>
-          <w:noProof/>
-          <w:color w:val="000000"/>
-          <w:sz w:val="20"/>
-          <w:szCs w:val="20"/>
-        </w:rPr>
-        <w:lastRenderedPageBreak/>
-        <mc:AlternateContent>
-          <mc:Choice Requires="wpg">
-            <w:drawing>
-              <wp:anchor distT="0" distB="0" distL="0" distR="0" simplePos="0" relativeHeight="251660288" behindDoc="1" locked="0" layoutInCell="1" hidden="0" allowOverlap="1" wp14:anchorId="523111C9" wp14:editId="523111CA">
-                <wp:simplePos x="0" y="0"/>
-                <wp:positionH relativeFrom="page">
-                  <wp:posOffset>909637</wp:posOffset>
-                </wp:positionH>
-                <wp:positionV relativeFrom="page">
-                  <wp:posOffset>1080198</wp:posOffset>
-                </wp:positionV>
-                <wp:extent cx="5953125" cy="3792854"/>
-                <wp:effectExtent l="0" t="0" r="0" b="0"/>
-                <wp:wrapNone/>
-                <wp:docPr id="9" name="Group 9"/>
-                <wp:cNvGraphicFramePr/>
-                <a:graphic xmlns:a="http://schemas.openxmlformats.org/drawingml/2006/main">
-                  <a:graphicData uri="http://schemas.microsoft.com/office/word/2010/wordprocessingGroup">
-                    <wpg:wgp>
-                      <wpg:cNvGrpSpPr/>
-                      <wpg:grpSpPr>
-                        <a:xfrm>
-                          <a:off x="0" y="0"/>
-                          <a:ext cx="5953125" cy="3792854"/>
-                          <a:chOff x="2369425" y="1883550"/>
-                          <a:chExt cx="5953150" cy="3792900"/>
-                        </a:xfrm>
-                      </wpg:grpSpPr>
-                      <wpg:grpSp>
-                        <wpg:cNvPr id="1017300872" name="Group 1017300872"/>
-                        <wpg:cNvGrpSpPr/>
-                        <wpg:grpSpPr>
-                          <a:xfrm>
-                            <a:off x="2369438" y="1883573"/>
-                            <a:ext cx="5953125" cy="3792850"/>
-                            <a:chOff x="0" y="0"/>
-                            <a:chExt cx="5953125" cy="3792850"/>
-                          </a:xfrm>
-                        </wpg:grpSpPr>
-                        <wps:wsp>
-                          <wps:cNvPr id="1395726572" name="Rectangle 1395726572"/>
-                          <wps:cNvSpPr/>
-                          <wps:spPr>
-                            <a:xfrm>
-                              <a:off x="0" y="0"/>
-                              <a:ext cx="5953125" cy="3792850"/>
-                            </a:xfrm>
-                            <a:prstGeom prst="rect">
-                              <a:avLst/>
-                            </a:prstGeom>
-                            <a:noFill/>
-                            <a:ln>
-                              <a:noFill/>
-                            </a:ln>
-                          </wps:spPr>
-                          <wps:txbx>
-                            <w:txbxContent>
-                              <w:p>
-                                <w:pPr>
-                                  <w:textDirection w:val="btLr"/>
-                                </w:pPr>
-                              </w:p>
-                            </w:txbxContent>
-                          </wps:txbx>
-                          <wps:bodyPr spcFirstLastPara="1" wrap="square" lIns="91425" tIns="91425" rIns="91425" bIns="91425" anchor="ctr" anchorCtr="0">
-                            <a:noAutofit/>
-                          </wps:bodyPr>
-                        </wps:wsp>
-                        <wps:wsp>
-                          <wps:cNvPr id="1697586551" name="Freeform: Shape 1697586551"/>
-                          <wps:cNvSpPr/>
-                          <wps:spPr>
-                            <a:xfrm>
-                              <a:off x="1892998" y="475805"/>
-                              <a:ext cx="3744595" cy="2113280"/>
-                            </a:xfrm>
-                            <a:custGeom>
-                              <a:avLst/>
-                              <a:gdLst/>
-                              <a:ahLst/>
-                              <a:cxnLst/>
-                              <a:rect l="l" t="t" r="r" b="b"/>
-                              <a:pathLst>
-                                <a:path w="3744595" h="2113280" extrusionOk="0">
-                                  <a:moveTo>
-                                    <a:pt x="0" y="286512"/>
-                                  </a:moveTo>
-                                  <a:lnTo>
-                                    <a:pt x="0" y="559307"/>
-                                  </a:lnTo>
-                                </a:path>
-                                <a:path w="3744595" h="2113280" extrusionOk="0">
-                                  <a:moveTo>
-                                    <a:pt x="0" y="0"/>
-                                  </a:moveTo>
-                                  <a:lnTo>
-                                    <a:pt x="0" y="135636"/>
-                                  </a:lnTo>
-                                </a:path>
-                                <a:path w="3744595" h="2113280" extrusionOk="0">
-                                  <a:moveTo>
-                                    <a:pt x="0" y="708660"/>
-                                  </a:moveTo>
-                                  <a:lnTo>
-                                    <a:pt x="0" y="2113280"/>
-                                  </a:lnTo>
-                                </a:path>
-                                <a:path w="3744595" h="2113280" extrusionOk="0">
-                                  <a:moveTo>
-                                    <a:pt x="623315" y="708660"/>
-                                  </a:moveTo>
-                                  <a:lnTo>
-                                    <a:pt x="623315" y="2113280"/>
-                                  </a:lnTo>
-                                </a:path>
-                                <a:path w="3744595" h="2113280" extrusionOk="0">
-                                  <a:moveTo>
-                                    <a:pt x="623315" y="286512"/>
-                                  </a:moveTo>
-                                  <a:lnTo>
-                                    <a:pt x="623315" y="559307"/>
-                                  </a:lnTo>
-                                </a:path>
-                                <a:path w="3744595" h="2113280" extrusionOk="0">
-                                  <a:moveTo>
-                                    <a:pt x="623315" y="0"/>
-                                  </a:moveTo>
-                                  <a:lnTo>
-                                    <a:pt x="623315" y="135636"/>
-                                  </a:lnTo>
-                                </a:path>
-                                <a:path w="3744595" h="2113280" extrusionOk="0">
-                                  <a:moveTo>
-                                    <a:pt x="1248155" y="708660"/>
-                                  </a:moveTo>
-                                  <a:lnTo>
-                                    <a:pt x="1248155" y="2113280"/>
-                                  </a:lnTo>
-                                </a:path>
-                                <a:path w="3744595" h="2113280" extrusionOk="0">
-                                  <a:moveTo>
-                                    <a:pt x="1248155" y="286512"/>
-                                  </a:moveTo>
-                                  <a:lnTo>
-                                    <a:pt x="1248155" y="559307"/>
-                                  </a:lnTo>
-                                </a:path>
-                                <a:path w="3744595" h="2113280" extrusionOk="0">
-                                  <a:moveTo>
-                                    <a:pt x="1248155" y="0"/>
-                                  </a:moveTo>
-                                  <a:lnTo>
-                                    <a:pt x="1248155" y="135636"/>
-                                  </a:lnTo>
-                                </a:path>
-                                <a:path w="3744595" h="2113280" extrusionOk="0">
-                                  <a:moveTo>
-                                    <a:pt x="1871472" y="286512"/>
-                                  </a:moveTo>
-                                  <a:lnTo>
-                                    <a:pt x="1871472" y="2113280"/>
-                                  </a:lnTo>
-                                </a:path>
-                                <a:path w="3744595" h="2113280" extrusionOk="0">
-                                  <a:moveTo>
-                                    <a:pt x="1871472" y="0"/>
-                                  </a:moveTo>
-                                  <a:lnTo>
-                                    <a:pt x="1871472" y="135636"/>
-                                  </a:lnTo>
-                                </a:path>
-                                <a:path w="3744595" h="2113280" extrusionOk="0">
-                                  <a:moveTo>
-                                    <a:pt x="2496312" y="286512"/>
-                                  </a:moveTo>
-                                  <a:lnTo>
-                                    <a:pt x="2496312" y="2113280"/>
-                                  </a:lnTo>
-                                </a:path>
-                                <a:path w="3744595" h="2113280" extrusionOk="0">
-                                  <a:moveTo>
-                                    <a:pt x="2496312" y="0"/>
-                                  </a:moveTo>
-                                  <a:lnTo>
-                                    <a:pt x="2496312" y="135636"/>
-                                  </a:lnTo>
-                                </a:path>
-                                <a:path w="3744595" h="2113280" extrusionOk="0">
-                                  <a:moveTo>
-                                    <a:pt x="3121152" y="286512"/>
-                                  </a:moveTo>
-                                  <a:lnTo>
-                                    <a:pt x="3121152" y="2113280"/>
-                                  </a:lnTo>
-                                </a:path>
-                                <a:path w="3744595" h="2113280" extrusionOk="0">
-                                  <a:moveTo>
-                                    <a:pt x="3121152" y="0"/>
-                                  </a:moveTo>
-                                  <a:lnTo>
-                                    <a:pt x="3121152" y="135636"/>
-                                  </a:lnTo>
-                                </a:path>
-                                <a:path w="3744595" h="2113280" extrusionOk="0">
-                                  <a:moveTo>
-                                    <a:pt x="3744594" y="0"/>
-                                  </a:moveTo>
-                                  <a:lnTo>
-                                    <a:pt x="3744594" y="2113280"/>
-                                  </a:lnTo>
-                                </a:path>
-                              </a:pathLst>
-                            </a:custGeom>
-                            <a:noFill/>
-                            <a:ln w="9525" cap="flat" cmpd="sng">
-                              <a:solidFill>
-                                <a:srgbClr val="D9D9D9"/>
-                              </a:solidFill>
-                              <a:prstDash val="solid"/>
-                              <a:round/>
-                              <a:headEnd type="none" w="sm" len="sm"/>
-                              <a:tailEnd type="none" w="sm" len="sm"/>
-                            </a:ln>
-                          </wps:spPr>
-                          <wps:bodyPr spcFirstLastPara="1" wrap="square" lIns="91425" tIns="91425" rIns="91425" bIns="91425" anchor="ctr" anchorCtr="0">
-                            <a:noAutofit/>
-                          </wps:bodyPr>
-                        </wps:wsp>
-                        <wps:wsp>
-                          <wps:cNvPr id="529429864" name="Freeform: Shape 529429864"/>
-                          <wps:cNvSpPr/>
-                          <wps:spPr>
-                            <a:xfrm>
-                              <a:off x="1268666" y="611441"/>
-                              <a:ext cx="4161790" cy="573405"/>
-                            </a:xfrm>
-                            <a:custGeom>
-                              <a:avLst/>
-                              <a:gdLst/>
-                              <a:ahLst/>
-                              <a:cxnLst/>
-                              <a:rect l="l" t="t" r="r" b="b"/>
-                              <a:pathLst>
-                                <a:path w="4161790" h="573405" extrusionOk="0">
-                                  <a:moveTo>
-                                    <a:pt x="2079752" y="423672"/>
-                                  </a:moveTo>
-                                  <a:lnTo>
-                                    <a:pt x="0" y="423672"/>
-                                  </a:lnTo>
-                                  <a:lnTo>
-                                    <a:pt x="0" y="573024"/>
-                                  </a:lnTo>
-                                  <a:lnTo>
-                                    <a:pt x="2079752" y="573024"/>
-                                  </a:lnTo>
-                                  <a:lnTo>
-                                    <a:pt x="2079752" y="423672"/>
-                                  </a:lnTo>
-                                  <a:close/>
-                                </a:path>
-                                <a:path w="4161790" h="573405" extrusionOk="0">
-                                  <a:moveTo>
-                                    <a:pt x="4161536" y="0"/>
-                                  </a:moveTo>
-                                  <a:lnTo>
-                                    <a:pt x="0" y="0"/>
-                                  </a:lnTo>
-                                  <a:lnTo>
-                                    <a:pt x="0" y="150876"/>
-                                  </a:lnTo>
-                                  <a:lnTo>
-                                    <a:pt x="4161536" y="150876"/>
-                                  </a:lnTo>
-                                  <a:lnTo>
-                                    <a:pt x="4161536" y="0"/>
-                                  </a:lnTo>
-                                  <a:close/>
-                                </a:path>
-                              </a:pathLst>
-                            </a:custGeom>
-                            <a:solidFill>
-                              <a:srgbClr val="EC7C30"/>
-                            </a:solidFill>
-                            <a:ln>
-                              <a:noFill/>
-                            </a:ln>
-                          </wps:spPr>
-                          <wps:bodyPr spcFirstLastPara="1" wrap="square" lIns="91425" tIns="91425" rIns="91425" bIns="91425" anchor="ctr" anchorCtr="0">
-                            <a:noAutofit/>
-                          </wps:bodyPr>
-                        </wps:wsp>
-                        <wps:wsp>
-                          <wps:cNvPr id="514391818" name="Freeform: Shape 514391818"/>
-                          <wps:cNvSpPr/>
-                          <wps:spPr>
-                            <a:xfrm>
-                              <a:off x="1268666" y="475805"/>
-                              <a:ext cx="1270" cy="2113280"/>
-                            </a:xfrm>
-                            <a:custGeom>
-                              <a:avLst/>
-                              <a:gdLst/>
-                              <a:ahLst/>
-                              <a:cxnLst/>
-                              <a:rect l="l" t="t" r="r" b="b"/>
-                              <a:pathLst>
-                                <a:path w="120000" h="2113280" extrusionOk="0">
-                                  <a:moveTo>
-                                    <a:pt x="0" y="2113280"/>
-                                  </a:moveTo>
-                                  <a:lnTo>
-                                    <a:pt x="0" y="0"/>
-                                  </a:lnTo>
-                                </a:path>
-                              </a:pathLst>
-                            </a:custGeom>
-                            <a:noFill/>
-                            <a:ln w="9525" cap="flat" cmpd="sng">
-                              <a:solidFill>
-                                <a:srgbClr val="D9D9D9"/>
-                              </a:solidFill>
-                              <a:prstDash val="solid"/>
-                              <a:round/>
-                              <a:headEnd type="none" w="sm" len="sm"/>
-                              <a:tailEnd type="none" w="sm" len="sm"/>
-                            </a:ln>
-                          </wps:spPr>
-                          <wps:bodyPr spcFirstLastPara="1" wrap="square" lIns="91425" tIns="91425" rIns="91425" bIns="91425" anchor="ctr" anchorCtr="0">
-                            <a:noAutofit/>
-                          </wps:bodyPr>
-                        </wps:wsp>
-                        <wps:wsp>
-                          <wps:cNvPr id="536643572" name="Freeform: Shape 536643572"/>
-                          <wps:cNvSpPr/>
-                          <wps:spPr>
-                            <a:xfrm>
-                              <a:off x="185381" y="3232175"/>
-                              <a:ext cx="2620010" cy="404495"/>
-                            </a:xfrm>
-                            <a:custGeom>
-                              <a:avLst/>
-                              <a:gdLst/>
-                              <a:ahLst/>
-                              <a:cxnLst/>
-                              <a:rect l="l" t="t" r="r" b="b"/>
-                              <a:pathLst>
-                                <a:path w="2620010" h="404495" extrusionOk="0">
-                                  <a:moveTo>
-                                    <a:pt x="62776" y="0"/>
-                                  </a:moveTo>
-                                  <a:lnTo>
-                                    <a:pt x="0" y="0"/>
-                                  </a:lnTo>
-                                  <a:lnTo>
-                                    <a:pt x="0" y="62776"/>
-                                  </a:lnTo>
-                                  <a:lnTo>
-                                    <a:pt x="62776" y="62776"/>
-                                  </a:lnTo>
-                                  <a:lnTo>
-                                    <a:pt x="62776" y="0"/>
-                                  </a:lnTo>
-                                  <a:close/>
-                                </a:path>
-                                <a:path w="2620010" h="404495" extrusionOk="0">
-                                  <a:moveTo>
-                                    <a:pt x="2619768" y="341122"/>
-                                  </a:moveTo>
-                                  <a:lnTo>
-                                    <a:pt x="2556992" y="341122"/>
-                                  </a:lnTo>
-                                  <a:lnTo>
-                                    <a:pt x="2556992" y="403898"/>
-                                  </a:lnTo>
-                                  <a:lnTo>
-                                    <a:pt x="2619768" y="403898"/>
-                                  </a:lnTo>
-                                  <a:lnTo>
-                                    <a:pt x="2619768" y="341122"/>
-                                  </a:lnTo>
-                                  <a:close/>
-                                </a:path>
-                              </a:pathLst>
-                            </a:custGeom>
-                            <a:solidFill>
-                              <a:srgbClr val="EC7C30"/>
-                            </a:solidFill>
-                            <a:ln>
-                              <a:noFill/>
-                            </a:ln>
-                          </wps:spPr>
-                          <wps:bodyPr spcFirstLastPara="1" wrap="square" lIns="91425" tIns="91425" rIns="91425" bIns="91425" anchor="ctr" anchorCtr="0">
-                            <a:noAutofit/>
-                          </wps:bodyPr>
-                        </wps:wsp>
-                        <wps:wsp>
-                          <wps:cNvPr id="1143358099" name="Freeform: Shape 1143358099"/>
-                          <wps:cNvSpPr/>
-                          <wps:spPr>
-                            <a:xfrm>
-                              <a:off x="4762" y="4762"/>
-                              <a:ext cx="5943600" cy="3783329"/>
-                            </a:xfrm>
-                            <a:custGeom>
-                              <a:avLst/>
-                              <a:gdLst/>
-                              <a:ahLst/>
-                              <a:cxnLst/>
-                              <a:rect l="l" t="t" r="r" b="b"/>
-                              <a:pathLst>
-                                <a:path w="5943600" h="3783329" extrusionOk="0">
-                                  <a:moveTo>
-                                    <a:pt x="0" y="3783329"/>
-                                  </a:moveTo>
-                                  <a:lnTo>
-                                    <a:pt x="5943600" y="3783329"/>
-                                  </a:lnTo>
-                                  <a:lnTo>
-                                    <a:pt x="5943600" y="0"/>
-                                  </a:lnTo>
-                                  <a:lnTo>
-                                    <a:pt x="0" y="0"/>
-                                  </a:lnTo>
-                                  <a:lnTo>
-                                    <a:pt x="0" y="3783329"/>
-                                  </a:lnTo>
-                                  <a:close/>
-                                </a:path>
-                              </a:pathLst>
-                            </a:custGeom>
-                            <a:noFill/>
-                            <a:ln w="9525" cap="flat" cmpd="sng">
-                              <a:solidFill>
-                                <a:srgbClr val="D9D9D9"/>
-                              </a:solidFill>
-                              <a:prstDash val="solid"/>
-                              <a:round/>
-                              <a:headEnd type="none" w="sm" len="sm"/>
-                              <a:tailEnd type="none" w="sm" len="sm"/>
-                            </a:ln>
-                          </wps:spPr>
-                          <wps:bodyPr spcFirstLastPara="1" wrap="square" lIns="91425" tIns="91425" rIns="91425" bIns="91425" anchor="ctr" anchorCtr="0">
-                            <a:noAutofit/>
-                          </wps:bodyPr>
-                        </wps:wsp>
-                        <wps:wsp>
-                          <wps:cNvPr id="679837295" name="Rectangle 679837295"/>
-                          <wps:cNvSpPr/>
-                          <wps:spPr>
-                            <a:xfrm>
-                              <a:off x="2030793" y="135699"/>
-                              <a:ext cx="1905635" cy="178435"/>
-                            </a:xfrm>
-                            <a:prstGeom prst="rect">
-                              <a:avLst/>
-                            </a:prstGeom>
-                            <a:noFill/>
-                            <a:ln>
-                              <a:noFill/>
-                            </a:ln>
-                          </wps:spPr>
-                          <wps:txbx>
-                            <w:txbxContent>
-                              <w:p>
-                                <w:pPr>
-                                  <w:spacing w:line="281" w:lineRule="auto"/>
-                                  <w:textDirection w:val="btLr"/>
-                                </w:pPr>
-                                <w:r>
-                                  <w:rPr>
-                                    <w:rFonts w:ascii="Calibri" w:eastAsia="Calibri" w:hAnsi="Calibri" w:cs="Calibri"/>
-                                    <w:color w:val="585858"/>
-                                    <w:sz w:val="28"/>
-                                  </w:rPr>
-                                  <w:t>PENILAIAN KESELURUHAN</w:t>
-                                </w:r>
-                              </w:p>
-                            </w:txbxContent>
-                          </wps:txbx>
-                          <wps:bodyPr spcFirstLastPara="1" wrap="square" lIns="0" tIns="0" rIns="0" bIns="0" anchor="t" anchorCtr="0">
-                            <a:noAutofit/>
-                          </wps:bodyPr>
-                        </wps:wsp>
-                        <wps:wsp>
-                          <wps:cNvPr id="1194073652" name="Rectangle 1194073652"/>
-                          <wps:cNvSpPr/>
-                          <wps:spPr>
-                            <a:xfrm>
-                              <a:off x="570420" y="633920"/>
-                              <a:ext cx="604520" cy="114300"/>
-                            </a:xfrm>
-                            <a:prstGeom prst="rect">
-                              <a:avLst/>
-                            </a:prstGeom>
-                            <a:noFill/>
-                            <a:ln>
-                              <a:noFill/>
-                            </a:ln>
-                          </wps:spPr>
-                          <wps:txbx>
-                            <w:txbxContent>
-                              <w:p>
-                                <w:pPr>
-                                  <w:spacing w:line="180" w:lineRule="auto"/>
-                                  <w:textDirection w:val="btLr"/>
-                                </w:pPr>
-                                <w:r>
-                                  <w:rPr>
-                                    <w:rFonts w:ascii="Calibri" w:eastAsia="Calibri" w:hAnsi="Calibri" w:cs="Calibri"/>
-                                    <w:color w:val="585858"/>
-                                    <w:sz w:val="18"/>
-                                  </w:rPr>
-                                  <w:t>CEMERLANG</w:t>
-                                </w:r>
-                              </w:p>
-                            </w:txbxContent>
-                          </wps:txbx>
-                          <wps:bodyPr spcFirstLastPara="1" wrap="square" lIns="0" tIns="0" rIns="0" bIns="0" anchor="t" anchorCtr="0">
-                            <a:noAutofit/>
-                          </wps:bodyPr>
-                        </wps:wsp>
-                        <wps:wsp>
-                          <wps:cNvPr id="1395050438" name="Rectangle 1395050438"/>
-                          <wps:cNvSpPr/>
-                          <wps:spPr>
-                            <a:xfrm>
-                              <a:off x="5506656" y="640016"/>
-                              <a:ext cx="210820" cy="114300"/>
-                            </a:xfrm>
-                            <a:prstGeom prst="rect">
-                              <a:avLst/>
-                            </a:prstGeom>
-                            <a:noFill/>
-                            <a:ln>
-                              <a:noFill/>
-                            </a:ln>
-                          </wps:spPr>
-                          <wps:txbx>
-                            <w:txbxContent>
-                              <w:p>
-                                <w:pPr>
-                                  <w:spacing w:line="180" w:lineRule="auto"/>
-                                  <w:textDirection w:val="btLr"/>
-                                </w:pPr>
-                                <w:r>
-                                  <w:rPr>
-                                    <w:rFonts w:ascii="Calibri" w:eastAsia="Calibri" w:hAnsi="Calibri" w:cs="Calibri"/>
-                                    <w:color w:val="404040"/>
-                                    <w:sz w:val="18"/>
-                                  </w:rPr>
-                                  <w:t>67%</w:t>
-                                </w:r>
-                              </w:p>
-                            </w:txbxContent>
-                          </wps:txbx>
-                          <wps:bodyPr spcFirstLastPara="1" wrap="square" lIns="0" tIns="0" rIns="0" bIns="0" anchor="t" anchorCtr="0">
-                            <a:noAutofit/>
-                          </wps:bodyPr>
-                        </wps:wsp>
-                        <wps:wsp>
-                          <wps:cNvPr id="529658237" name="Rectangle 529658237"/>
-                          <wps:cNvSpPr/>
-                          <wps:spPr>
-                            <a:xfrm>
-                              <a:off x="946594" y="1056703"/>
-                              <a:ext cx="229235" cy="114300"/>
-                            </a:xfrm>
-                            <a:prstGeom prst="rect">
-                              <a:avLst/>
-                            </a:prstGeom>
-                            <a:noFill/>
-                            <a:ln>
-                              <a:noFill/>
-                            </a:ln>
-                          </wps:spPr>
-                          <wps:txbx>
-                            <w:txbxContent>
-                              <w:p>
-                                <w:pPr>
-                                  <w:spacing w:line="180" w:lineRule="auto"/>
-                                  <w:textDirection w:val="btLr"/>
-                                </w:pPr>
-                                <w:r>
-                                  <w:rPr>
-                                    <w:rFonts w:ascii="Calibri" w:eastAsia="Calibri" w:hAnsi="Calibri" w:cs="Calibri"/>
-                                    <w:color w:val="585858"/>
-                                    <w:sz w:val="18"/>
-                                  </w:rPr>
-                                  <w:t>BAIK</w:t>
-                                </w:r>
-                              </w:p>
-                            </w:txbxContent>
-                          </wps:txbx>
-                          <wps:bodyPr spcFirstLastPara="1" wrap="square" lIns="0" tIns="0" rIns="0" bIns="0" anchor="t" anchorCtr="0">
-                            <a:noAutofit/>
-                          </wps:bodyPr>
-                        </wps:wsp>
-                        <wps:wsp>
-                          <wps:cNvPr id="680552488" name="Rectangle 680552488"/>
-                          <wps:cNvSpPr/>
-                          <wps:spPr>
-                            <a:xfrm>
-                              <a:off x="3425888" y="1062799"/>
-                              <a:ext cx="210820" cy="114300"/>
-                            </a:xfrm>
-                            <a:prstGeom prst="rect">
-                              <a:avLst/>
-                            </a:prstGeom>
-                            <a:noFill/>
-                            <a:ln>
-                              <a:noFill/>
-                            </a:ln>
-                          </wps:spPr>
-                          <wps:txbx>
-                            <w:txbxContent>
-                              <w:p>
-                                <w:pPr>
-                                  <w:spacing w:line="180" w:lineRule="auto"/>
-                                  <w:textDirection w:val="btLr"/>
-                                </w:pPr>
-                                <w:r>
-                                  <w:rPr>
-                                    <w:rFonts w:ascii="Calibri" w:eastAsia="Calibri" w:hAnsi="Calibri" w:cs="Calibri"/>
-                                    <w:color w:val="404040"/>
-                                    <w:sz w:val="18"/>
-                                  </w:rPr>
-                                  <w:t>33%</w:t>
-                                </w:r>
-                              </w:p>
-                            </w:txbxContent>
-                          </wps:txbx>
-                          <wps:bodyPr spcFirstLastPara="1" wrap="square" lIns="0" tIns="0" rIns="0" bIns="0" anchor="t" anchorCtr="0">
-                            <a:noAutofit/>
-                          </wps:bodyPr>
-                        </wps:wsp>
-                        <wps:wsp>
-                          <wps:cNvPr id="1979172305" name="Rectangle 1979172305"/>
-                          <wps:cNvSpPr/>
-                          <wps:spPr>
-                            <a:xfrm>
-                              <a:off x="520128" y="1478876"/>
-                              <a:ext cx="977265" cy="121285"/>
-                            </a:xfrm>
-                            <a:prstGeom prst="rect">
-                              <a:avLst/>
-                            </a:prstGeom>
-                            <a:noFill/>
-                            <a:ln>
-                              <a:noFill/>
-                            </a:ln>
-                          </wps:spPr>
-                          <wps:txbx>
-                            <w:txbxContent>
-                              <w:p>
-                                <w:pPr>
-                                  <w:spacing w:line="191" w:lineRule="auto"/>
-                                  <w:textDirection w:val="btLr"/>
-                                </w:pPr>
-                                <w:r>
-                                  <w:rPr>
-                                    <w:rFonts w:ascii="Calibri" w:eastAsia="Calibri" w:hAnsi="Calibri" w:cs="Calibri"/>
-                                    <w:color w:val="585858"/>
-                                    <w:sz w:val="18"/>
-                                  </w:rPr>
-                                  <w:t>MEMUASKAN</w:t>
-                                </w:r>
-                                <w:r>
-                                  <w:rPr>
-                                    <w:rFonts w:ascii="Calibri" w:eastAsia="Calibri" w:hAnsi="Calibri" w:cs="Calibri"/>
-                                    <w:color w:val="585858"/>
-                                    <w:sz w:val="18"/>
-                                  </w:rPr>
-                                  <w:tab/>
-                                </w:r>
-                                <w:r>
-                                  <w:rPr>
-                                    <w:rFonts w:ascii="Calibri" w:eastAsia="Calibri" w:hAnsi="Calibri" w:cs="Calibri"/>
-                                    <w:color w:val="404040"/>
-                                    <w:sz w:val="18"/>
-                                  </w:rPr>
-                                  <w:t>0%</w:t>
-                                </w:r>
-                              </w:p>
-                            </w:txbxContent>
-                          </wps:txbx>
-                          <wps:bodyPr spcFirstLastPara="1" wrap="square" lIns="0" tIns="0" rIns="0" bIns="0" anchor="t" anchorCtr="0">
-                            <a:noAutofit/>
-                          </wps:bodyPr>
-                        </wps:wsp>
-                        <wps:wsp>
-                          <wps:cNvPr id="1520678502" name="Rectangle 1520678502"/>
-                          <wps:cNvSpPr/>
-                          <wps:spPr>
-                            <a:xfrm>
-                              <a:off x="87363" y="1901888"/>
-                              <a:ext cx="1410335" cy="120650"/>
-                            </a:xfrm>
-                            <a:prstGeom prst="rect">
-                              <a:avLst/>
-                            </a:prstGeom>
-                            <a:noFill/>
-                            <a:ln>
-                              <a:noFill/>
-                            </a:ln>
-                          </wps:spPr>
-                          <wps:txbx>
-                            <w:txbxContent>
-                              <w:p>
-                                <w:pPr>
-                                  <w:spacing w:line="189" w:lineRule="auto"/>
-                                  <w:textDirection w:val="btLr"/>
-                                </w:pPr>
-                                <w:r>
-                                  <w:rPr>
-                                    <w:rFonts w:ascii="Calibri" w:eastAsia="Calibri" w:hAnsi="Calibri" w:cs="Calibri"/>
-                                    <w:color w:val="585858"/>
-                                    <w:sz w:val="18"/>
-                                  </w:rPr>
-                                  <w:t>KURANG MEMUASKAN</w:t>
-                                </w:r>
-                                <w:r>
-                                  <w:rPr>
-                                    <w:rFonts w:ascii="Calibri" w:eastAsia="Calibri" w:hAnsi="Calibri" w:cs="Calibri"/>
-                                    <w:color w:val="585858"/>
-                                    <w:sz w:val="18"/>
-                                  </w:rPr>
-                                  <w:tab/>
-                                </w:r>
-                                <w:r>
-                                  <w:rPr>
-                                    <w:rFonts w:ascii="Calibri" w:eastAsia="Calibri" w:hAnsi="Calibri" w:cs="Calibri"/>
-                                    <w:color w:val="404040"/>
-                                    <w:sz w:val="18"/>
-                                  </w:rPr>
-                                  <w:t>0%</w:t>
-                                </w:r>
-                              </w:p>
-                            </w:txbxContent>
-                          </wps:txbx>
-                          <wps:bodyPr spcFirstLastPara="1" wrap="square" lIns="0" tIns="0" rIns="0" bIns="0" anchor="t" anchorCtr="0">
-                            <a:noAutofit/>
-                          </wps:bodyPr>
-                        </wps:wsp>
-                        <wps:wsp>
-                          <wps:cNvPr id="1337951336" name="Rectangle 1337951336"/>
-                          <wps:cNvSpPr/>
-                          <wps:spPr>
-                            <a:xfrm>
-                              <a:off x="214160" y="2324671"/>
-                              <a:ext cx="1863725" cy="474345"/>
-                            </a:xfrm>
-                            <a:prstGeom prst="rect">
-                              <a:avLst/>
-                            </a:prstGeom>
-                            <a:noFill/>
-                            <a:ln>
-                              <a:noFill/>
-                            </a:ln>
-                          </wps:spPr>
-                          <wps:txbx>
-                            <w:txbxContent>
-                              <w:p>
-                                <w:pPr>
-                                  <w:spacing w:line="192" w:lineRule="auto"/>
-                                  <w:textDirection w:val="btLr"/>
-                                </w:pPr>
-                                <w:r>
-                                  <w:rPr>
-                                    <w:rFonts w:ascii="Calibri" w:eastAsia="Calibri" w:hAnsi="Calibri" w:cs="Calibri"/>
-                                    <w:color w:val="585858"/>
-                                    <w:sz w:val="18"/>
-                                  </w:rPr>
-                                  <w:t>TIDAK MEMUASKAN</w:t>
-                                </w:r>
-                                <w:r>
-                                  <w:rPr>
-                                    <w:rFonts w:ascii="Calibri" w:eastAsia="Calibri" w:hAnsi="Calibri" w:cs="Calibri"/>
-                                    <w:color w:val="585858"/>
-                                    <w:sz w:val="18"/>
-                                  </w:rPr>
-                                  <w:tab/>
-                                </w:r>
-                                <w:r>
-                                  <w:rPr>
-                                    <w:rFonts w:ascii="Calibri" w:eastAsia="Calibri" w:hAnsi="Calibri" w:cs="Calibri"/>
-                                    <w:color w:val="404040"/>
-                                    <w:sz w:val="18"/>
-                                  </w:rPr>
-                                  <w:t>0%</w:t>
-                                </w:r>
-                              </w:p>
-                              <w:p>
-                                <w:pPr>
-                                  <w:spacing w:before="116"/>
-                                  <w:textDirection w:val="btLr"/>
-                                </w:pPr>
-                              </w:p>
-                              <w:p>
-                                <w:pPr>
-                                  <w:spacing w:line="215" w:lineRule="auto"/>
-                                  <w:ind w:left="1436" w:firstLine="1436"/>
-                                  <w:textDirection w:val="btLr"/>
-                                </w:pPr>
-                                <w:r>
-                                  <w:rPr>
-                                    <w:rFonts w:ascii="Calibri" w:eastAsia="Calibri" w:hAnsi="Calibri" w:cs="Calibri"/>
-                                    <w:color w:val="585858"/>
-                                    <w:sz w:val="18"/>
-                                  </w:rPr>
-                                  <w:t>0.00%</w:t>
-                                </w:r>
-                                <w:r>
-                                  <w:rPr>
-                                    <w:rFonts w:ascii="Calibri" w:eastAsia="Calibri" w:hAnsi="Calibri" w:cs="Calibri"/>
-                                    <w:color w:val="585858"/>
-                                    <w:sz w:val="18"/>
-                                  </w:rPr>
-                                  <w:tab/>
-                                  <w:t>10.00%</w:t>
-                                </w:r>
-                              </w:p>
-                            </w:txbxContent>
-                          </wps:txbx>
-                          <wps:bodyPr spcFirstLastPara="1" wrap="square" lIns="0" tIns="0" rIns="0" bIns="0" anchor="t" anchorCtr="0">
-                            <a:noAutofit/>
-                          </wps:bodyPr>
-                        </wps:wsp>
-                        <wps:wsp>
-                          <wps:cNvPr id="2038623748" name="Rectangle 2038623748"/>
-                          <wps:cNvSpPr/>
-                          <wps:spPr>
-                            <a:xfrm>
-                              <a:off x="2346515" y="2684589"/>
-                              <a:ext cx="979805" cy="114300"/>
-                            </a:xfrm>
-                            <a:prstGeom prst="rect">
-                              <a:avLst/>
-                            </a:prstGeom>
-                            <a:noFill/>
-                            <a:ln>
-                              <a:noFill/>
-                            </a:ln>
-                          </wps:spPr>
-                          <wps:txbx>
-                            <w:txbxContent>
-                              <w:p>
-                                <w:pPr>
-                                  <w:spacing w:line="180" w:lineRule="auto"/>
-                                  <w:textDirection w:val="btLr"/>
-                                </w:pPr>
-                                <w:r>
-                                  <w:rPr>
-                                    <w:rFonts w:ascii="Calibri" w:eastAsia="Calibri" w:hAnsi="Calibri" w:cs="Calibri"/>
-                                    <w:color w:val="585858"/>
-                                    <w:sz w:val="18"/>
-                                  </w:rPr>
-                                  <w:t>20.00%</w:t>
-                                </w:r>
-                                <w:r>
-                                  <w:rPr>
-                                    <w:rFonts w:ascii="Calibri" w:eastAsia="Calibri" w:hAnsi="Calibri" w:cs="Calibri"/>
-                                    <w:color w:val="585858"/>
-                                    <w:sz w:val="18"/>
-                                  </w:rPr>
-                                  <w:tab/>
-                                  <w:t>30.00%</w:t>
-                                </w:r>
-                              </w:p>
-                            </w:txbxContent>
-                          </wps:txbx>
-                          <wps:bodyPr spcFirstLastPara="1" wrap="square" lIns="0" tIns="0" rIns="0" bIns="0" anchor="t" anchorCtr="0">
-                            <a:noAutofit/>
-                          </wps:bodyPr>
-                        </wps:wsp>
-                        <wps:wsp>
-                          <wps:cNvPr id="867845957" name="Rectangle 867845957"/>
-                          <wps:cNvSpPr/>
-                          <wps:spPr>
-                            <a:xfrm>
-                              <a:off x="3595052" y="2684589"/>
-                              <a:ext cx="355600" cy="114300"/>
-                            </a:xfrm>
-                            <a:prstGeom prst="rect">
-                              <a:avLst/>
-                            </a:prstGeom>
-                            <a:noFill/>
-                            <a:ln>
-                              <a:noFill/>
-                            </a:ln>
-                          </wps:spPr>
-                          <wps:txbx>
-                            <w:txbxContent>
-                              <w:p>
-                                <w:pPr>
-                                  <w:spacing w:line="180" w:lineRule="auto"/>
-                                  <w:textDirection w:val="btLr"/>
-                                </w:pPr>
-                                <w:r>
-                                  <w:rPr>
-                                    <w:rFonts w:ascii="Calibri" w:eastAsia="Calibri" w:hAnsi="Calibri" w:cs="Calibri"/>
-                                    <w:color w:val="585858"/>
-                                    <w:sz w:val="18"/>
-                                  </w:rPr>
-                                  <w:t>40.00%</w:t>
-                                </w:r>
-                              </w:p>
-                            </w:txbxContent>
-                          </wps:txbx>
-                          <wps:bodyPr spcFirstLastPara="1" wrap="square" lIns="0" tIns="0" rIns="0" bIns="0" anchor="t" anchorCtr="0">
-                            <a:noAutofit/>
-                          </wps:bodyPr>
-                        </wps:wsp>
-                        <wps:wsp>
-                          <wps:cNvPr id="893660851" name="Rectangle 893660851"/>
-                          <wps:cNvSpPr/>
-                          <wps:spPr>
-                            <a:xfrm>
-                              <a:off x="4219257" y="2684589"/>
-                              <a:ext cx="355600" cy="114300"/>
-                            </a:xfrm>
-                            <a:prstGeom prst="rect">
-                              <a:avLst/>
-                            </a:prstGeom>
-                            <a:noFill/>
-                            <a:ln>
-                              <a:noFill/>
-                            </a:ln>
-                          </wps:spPr>
-                          <wps:txbx>
-                            <w:txbxContent>
-                              <w:p>
-                                <w:pPr>
-                                  <w:spacing w:line="180" w:lineRule="auto"/>
-                                  <w:textDirection w:val="btLr"/>
-                                </w:pPr>
-                                <w:r>
-                                  <w:rPr>
-                                    <w:rFonts w:ascii="Calibri" w:eastAsia="Calibri" w:hAnsi="Calibri" w:cs="Calibri"/>
-                                    <w:color w:val="585858"/>
-                                    <w:sz w:val="18"/>
-                                  </w:rPr>
-                                  <w:t>50.00%</w:t>
-                                </w:r>
-                              </w:p>
-                            </w:txbxContent>
-                          </wps:txbx>
-                          <wps:bodyPr spcFirstLastPara="1" wrap="square" lIns="0" tIns="0" rIns="0" bIns="0" anchor="t" anchorCtr="0">
-                            <a:noAutofit/>
-                          </wps:bodyPr>
-                        </wps:wsp>
-                        <wps:wsp>
-                          <wps:cNvPr id="1487334765" name="Rectangle 1487334765"/>
-                          <wps:cNvSpPr/>
-                          <wps:spPr>
-                            <a:xfrm>
-                              <a:off x="4843462" y="2684589"/>
-                              <a:ext cx="355600" cy="114300"/>
-                            </a:xfrm>
-                            <a:prstGeom prst="rect">
-                              <a:avLst/>
-                            </a:prstGeom>
-                            <a:noFill/>
-                            <a:ln>
-                              <a:noFill/>
-                            </a:ln>
-                          </wps:spPr>
-                          <wps:txbx>
-                            <w:txbxContent>
-                              <w:p>
-                                <w:pPr>
-                                  <w:spacing w:line="180" w:lineRule="auto"/>
-                                  <w:textDirection w:val="btLr"/>
-                                </w:pPr>
-                                <w:r>
-                                  <w:rPr>
-                                    <w:rFonts w:ascii="Calibri" w:eastAsia="Calibri" w:hAnsi="Calibri" w:cs="Calibri"/>
-                                    <w:color w:val="585858"/>
-                                    <w:sz w:val="18"/>
-                                  </w:rPr>
-                                  <w:t>60.00%</w:t>
-                                </w:r>
-                              </w:p>
-                            </w:txbxContent>
-                          </wps:txbx>
-                          <wps:bodyPr spcFirstLastPara="1" wrap="square" lIns="0" tIns="0" rIns="0" bIns="0" anchor="t" anchorCtr="0">
-                            <a:noAutofit/>
-                          </wps:bodyPr>
-                        </wps:wsp>
-                        <wps:wsp>
-                          <wps:cNvPr id="745270486" name="Rectangle 745270486"/>
-                          <wps:cNvSpPr/>
-                          <wps:spPr>
-                            <a:xfrm>
-                              <a:off x="5467667" y="2684589"/>
-                              <a:ext cx="355600" cy="114300"/>
-                            </a:xfrm>
-                            <a:prstGeom prst="rect">
-                              <a:avLst/>
-                            </a:prstGeom>
-                            <a:noFill/>
-                            <a:ln>
-                              <a:noFill/>
-                            </a:ln>
-                          </wps:spPr>
-                          <wps:txbx>
-                            <w:txbxContent>
-                              <w:p>
-                                <w:pPr>
-                                  <w:spacing w:line="180" w:lineRule="auto"/>
-                                  <w:textDirection w:val="btLr"/>
-                                </w:pPr>
-                                <w:r>
-                                  <w:rPr>
-                                    <w:rFonts w:ascii="Calibri" w:eastAsia="Calibri" w:hAnsi="Calibri" w:cs="Calibri"/>
-                                    <w:color w:val="585858"/>
-                                    <w:sz w:val="18"/>
-                                  </w:rPr>
-                                  <w:t>70.00%</w:t>
-                                </w:r>
-                              </w:p>
-                            </w:txbxContent>
-                          </wps:txbx>
-                          <wps:bodyPr spcFirstLastPara="1" wrap="square" lIns="0" tIns="0" rIns="0" bIns="0" anchor="t" anchorCtr="0">
-                            <a:noAutofit/>
-                          </wps:bodyPr>
-                        </wps:wsp>
-                        <wps:wsp>
-                          <wps:cNvPr id="2087903911" name="Rectangle 2087903911"/>
-                          <wps:cNvSpPr/>
-                          <wps:spPr>
-                            <a:xfrm>
-                              <a:off x="2832417" y="3551745"/>
-                              <a:ext cx="437515" cy="114300"/>
-                            </a:xfrm>
-                            <a:prstGeom prst="rect">
-                              <a:avLst/>
-                            </a:prstGeom>
-                            <a:noFill/>
-                            <a:ln>
-                              <a:noFill/>
-                            </a:ln>
-                          </wps:spPr>
-                          <wps:txbx>
-                            <w:txbxContent>
-                              <w:p>
-                                <w:pPr>
-                                  <w:spacing w:line="180" w:lineRule="auto"/>
-                                  <w:textDirection w:val="btLr"/>
-                                </w:pPr>
-                                <w:r>
-                                  <w:rPr>
-                                    <w:rFonts w:ascii="Calibri" w:eastAsia="Calibri" w:hAnsi="Calibri" w:cs="Calibri"/>
-                                    <w:color w:val="585858"/>
-                                    <w:sz w:val="18"/>
-                                  </w:rPr>
-                                  <w:t>PERATUS</w:t>
-                                </w:r>
-                              </w:p>
-                            </w:txbxContent>
-                          </wps:txbx>
-                          <wps:bodyPr spcFirstLastPara="1" wrap="square" lIns="0" tIns="0" rIns="0" bIns="0" anchor="t" anchorCtr="0">
-                            <a:noAutofit/>
-                          </wps:bodyPr>
-                        </wps:wsp>
-                      </wpg:grpSp>
-                    </wpg:wgp>
-                  </a:graphicData>
-                </a:graphic>
-              </wp:anchor>
-            </w:drawing>
-          </mc:Choice>
-          <mc:Fallback>
-            <w:pict>
-              <v:group w14:anchorId="523111C9" id="Group 9" o:spid="_x0000_s1026" style="position:absolute;margin-left:71.6pt;margin-top:85.05pt;width:468.75pt;height:298.65pt;z-index:-251656192;mso-wrap-distance-left:0;mso-wrap-distance-right:0;mso-position-horizontal-relative:page;mso-position-vertical-relative:page" coordorigin="23694,18835" coordsize="59531,37929" o:gfxdata="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">
-                <v:group id="Group 1017300872" o:spid="_x0000_s1027" style="position:absolute;left:23694;top:18835;width:59531;height:37929" coordsize="59531,37928" o:gfxdata="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">
-                  <v:rect id="Rectangle 1395726572" o:spid="_x0000_s1028" style="position:absolute;width:59531;height:37928;visibility:visible;mso-wrap-style:square;v-text-anchor:middle" o:gfxdata="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" filled="f" stroked="f">
-                    <v:textbox inset="2.53958mm,2.53958mm,2.53958mm,2.53958mm">
-                      <w:txbxContent>
-                        <w:p>
-                          <w:pPr>
-                            <w:textDirection w:val="btLr"/>
-                          </w:pPr>
-                        </w:p>
-                      </w:txbxContent>
-                    </v:textbox>
-                  </v:rect>
-                  <v:shape id="Freeform: Shape 1697586551" o:spid="_x0000_s1029" style="position:absolute;left:18929;top:4758;width:37446;height:21132;visibility:visible;mso-wrap-style:square;v-text-anchor:middle" coordsize="3744595,2113280" o:gfxdata="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" path="m,286512l,559307em,l,135636em,708660l,2113280em623315,708660r,1404620em623315,286512r,272795em623315,r,135636em1248155,708660r,1404620em1248155,286512r,272795em1248155,r,135636em1871472,286512r,1826768em1871472,r,135636em2496312,286512r,1826768em2496312,r,135636em3121152,286512r,1826768em3121152,r,135636em3744594,r,2113280e" filled="f" strokecolor="#d9d9d9">
-                    <v:stroke startarrowwidth="narrow" startarrowlength="short" endarrowwidth="narrow" endarrowlength="short"/>
-                    <v:path arrowok="t" o:extrusionok="f"/>
-                  </v:shape>
-                  <v:shape id="Freeform: Shape 529429864" o:spid="_x0000_s1030" style="position:absolute;left:12686;top:6114;width:41618;height:5734;visibility:visible;mso-wrap-style:square;v-text-anchor:middle" coordsize="4161790,573405" o:gfxdata="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" path="m2079752,423672l,423672,,573024r2079752,l2079752,423672xem4161536,l,,,150876r4161536,l4161536,xe" fillcolor="#ec7c30" stroked="f">
-                    <v:path arrowok="t" o:extrusionok="f"/>
-                  </v:shape>
-                  <v:shape id="Freeform: Shape 514391818" o:spid="_x0000_s1031" style="position:absolute;left:12686;top:4758;width:13;height:21132;visibility:visible;mso-wrap-style:square;v-text-anchor:middle" coordsize="120000,2113280" o:gfxdata="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" path="m,2113280l,e" filled="f" strokecolor="#d9d9d9">
-                    <v:stroke startarrowwidth="narrow" startarrowlength="short" endarrowwidth="narrow" endarrowlength="short"/>
-                    <v:path arrowok="t" o:extrusionok="f"/>
-                  </v:shape>
-                  <v:shape id="Freeform: Shape 536643572" o:spid="_x0000_s1032" style="position:absolute;left:1853;top:32321;width:26200;height:4045;visibility:visible;mso-wrap-style:square;v-text-anchor:middle" coordsize="2620010,404495" o:gfxdata="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" path="m62776,l,,,62776r62776,l62776,xem2619768,341122r-62776,l2556992,403898r62776,l2619768,341122xe" fillcolor="#ec7c30" stroked="f">
-                    <v:path arrowok="t" o:extrusionok="f"/>
-                  </v:shape>
-                  <v:shape id="Freeform: Shape 1143358099" o:spid="_x0000_s1033" style="position:absolute;left:47;top:47;width:59436;height:37833;visibility:visible;mso-wrap-style:square;v-text-anchor:middle" coordsize="5943600,3783329" o:gfxdata="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" path="m,3783329r5943600,l5943600,,,,,3783329xe" filled="f" strokecolor="#d9d9d9">
-                    <v:stroke startarrowwidth="narrow" startarrowlength="short" endarrowwidth="narrow" endarrowlength="short"/>
-                    <v:path arrowok="t" o:extrusionok="f"/>
-                  </v:shape>
-                  <v:rect id="Rectangle 679837295" o:spid="_x0000_s1034" style="position:absolute;left:20307;top:1356;width:19057;height:1785;visibility:visible;mso-wrap-style:square;v-text-anchor:top" o:gfxdata="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" filled="f" stroked="f">
-                    <v:textbox inset="0,0,0,0">
-                      <w:txbxContent>
-                        <w:p>
-                          <w:pPr>
-                            <w:spacing w:line="281" w:lineRule="auto"/>
-                            <w:textDirection w:val="btLr"/>
-                          </w:pPr>
-                          <w:r>
-                            <w:rPr>
-                              <w:rFonts w:ascii="Calibri" w:eastAsia="Calibri" w:hAnsi="Calibri" w:cs="Calibri"/>
-                              <w:color w:val="585858"/>
-                              <w:sz w:val="28"/>
-                            </w:rPr>
-                            <w:t>PENILAIAN KESELURUHAN</w:t>
-                          </w:r>
-                        </w:p>
-                      </w:txbxContent>
-                    </v:textbox>
-                  </v:rect>
-                  <v:rect id="Rectangle 1194073652" o:spid="_x0000_s1035" style="position:absolute;left:5704;top:6339;width:6045;height:1143;visibility:visible;mso-wrap-style:square;v-text-anchor:top" o:gfxdata="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" filled="f" stroked="f">
-                    <v:textbox inset="0,0,0,0">
-                      <w:txbxContent>
-                        <w:p>
-                          <w:pPr>
-                            <w:spacing w:line="180" w:lineRule="auto"/>
-                            <w:textDirection w:val="btLr"/>
-                          </w:pPr>
-                          <w:r>
-                            <w:rPr>
-                              <w:rFonts w:ascii="Calibri" w:eastAsia="Calibri" w:hAnsi="Calibri" w:cs="Calibri"/>
-                              <w:color w:val="585858"/>
-                              <w:sz w:val="18"/>
-                            </w:rPr>
-                            <w:t>CEMERLANG</w:t>
-                          </w:r>
-                        </w:p>
-                      </w:txbxContent>
-                    </v:textbox>
-                  </v:rect>
-                  <v:rect id="Rectangle 1395050438" o:spid="_x0000_s1036" style="position:absolute;left:55066;top:6400;width:2108;height:1143;visibility:visible;mso-wrap-style:square;v-text-anchor:top" o:gfxdata="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" filled="f" stroked="f">
-                    <v:textbox inset="0,0,0,0">
-                      <w:txbxContent>
-                        <w:p>
-                          <w:pPr>
-                            <w:spacing w:line="180" w:lineRule="auto"/>
-                            <w:textDirection w:val="btLr"/>
-                          </w:pPr>
-                          <w:r>
-                            <w:rPr>
-                              <w:rFonts w:ascii="Calibri" w:eastAsia="Calibri" w:hAnsi="Calibri" w:cs="Calibri"/>
-                              <w:color w:val="404040"/>
-                              <w:sz w:val="18"/>
-                            </w:rPr>
-                            <w:t>67%</w:t>
-                          </w:r>
-                        </w:p>
-                      </w:txbxContent>
-                    </v:textbox>
-                  </v:rect>
-                  <v:rect id="Rectangle 529658237" o:spid="_x0000_s1037" style="position:absolute;left:9465;top:10567;width:2293;height:1143;visibility:visible;mso-wrap-style:square;v-text-anchor:top" o:gfxdata="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" filled="f" stroked="f">
-                    <v:textbox inset="0,0,0,0">
-                      <w:txbxContent>
-                        <w:p>
-                          <w:pPr>
-                            <w:spacing w:line="180" w:lineRule="auto"/>
-                            <w:textDirection w:val="btLr"/>
-                          </w:pPr>
-                          <w:r>
-                            <w:rPr>
-                              <w:rFonts w:ascii="Calibri" w:eastAsia="Calibri" w:hAnsi="Calibri" w:cs="Calibri"/>
-                              <w:color w:val="585858"/>
-                              <w:sz w:val="18"/>
-                            </w:rPr>
-                            <w:t>BAIK</w:t>
-                          </w:r>
-                        </w:p>
-                      </w:txbxContent>
-                    </v:textbox>
-                  </v:rect>
-                  <v:rect id="Rectangle 680552488" o:spid="_x0000_s1038" style="position:absolute;left:34258;top:10627;width:2109;height:1143;visibility:visible;mso-wrap-style:square;v-text-anchor:top" o:gfxdata="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" filled="f" stroked="f">
-                    <v:textbox inset="0,0,0,0">
-                      <w:txbxContent>
-                        <w:p>
-                          <w:pPr>
-                            <w:spacing w:line="180" w:lineRule="auto"/>
-                            <w:textDirection w:val="btLr"/>
-                          </w:pPr>
-                          <w:r>
-                            <w:rPr>
-                              <w:rFonts w:ascii="Calibri" w:eastAsia="Calibri" w:hAnsi="Calibri" w:cs="Calibri"/>
-                              <w:color w:val="404040"/>
-                              <w:sz w:val="18"/>
-                            </w:rPr>
-                            <w:t>33%</w:t>
-                          </w:r>
-                        </w:p>
-                      </w:txbxContent>
-                    </v:textbox>
-                  </v:rect>
-                  <v:rect id="Rectangle 1979172305" o:spid="_x0000_s1039" style="position:absolute;left:5201;top:14788;width:9772;height:1213;visibility:visible;mso-wrap-style:square;v-text-anchor:top" o:gfxdata="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" filled="f" stroked="f">
-                    <v:textbox inset="0,0,0,0">
-                      <w:txbxContent>
-                        <w:p>
-                          <w:pPr>
-                            <w:spacing w:line="191" w:lineRule="auto"/>
-                            <w:textDirection w:val="btLr"/>
-                          </w:pPr>
-                          <w:r>
-                            <w:rPr>
-                              <w:rFonts w:ascii="Calibri" w:eastAsia="Calibri" w:hAnsi="Calibri" w:cs="Calibri"/>
-                              <w:color w:val="585858"/>
-                              <w:sz w:val="18"/>
-                            </w:rPr>
-                            <w:t>MEMUASKAN</w:t>
-                          </w:r>
-                          <w:r>
-                            <w:rPr>
-                              <w:rFonts w:ascii="Calibri" w:eastAsia="Calibri" w:hAnsi="Calibri" w:cs="Calibri"/>
-                              <w:color w:val="585858"/>
-                              <w:sz w:val="18"/>
-                            </w:rPr>
-                            <w:tab/>
-                          </w:r>
-                          <w:r>
-                            <w:rPr>
-                              <w:rFonts w:ascii="Calibri" w:eastAsia="Calibri" w:hAnsi="Calibri" w:cs="Calibri"/>
-                              <w:color w:val="404040"/>
-                              <w:sz w:val="18"/>
-                            </w:rPr>
-                            <w:t>0%</w:t>
-                          </w:r>
-                        </w:p>
-                      </w:txbxContent>
-                    </v:textbox>
-                  </v:rect>
-                  <v:rect id="Rectangle 1520678502" o:spid="_x0000_s1040" style="position:absolute;left:873;top:19018;width:14103;height:1207;visibility:visible;mso-wrap-style:square;v-text-anchor:top" o:gfxdata="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" filled="f" stroked="f">
-                    <v:textbox inset="0,0,0,0">
-                      <w:txbxContent>
-                        <w:p>
-                          <w:pPr>
-                            <w:spacing w:line="189" w:lineRule="auto"/>
-                            <w:textDirection w:val="btLr"/>
-                          </w:pPr>
-                          <w:r>
-                            <w:rPr>
-                              <w:rFonts w:ascii="Calibri" w:eastAsia="Calibri" w:hAnsi="Calibri" w:cs="Calibri"/>
-                              <w:color w:val="585858"/>
-                              <w:sz w:val="18"/>
-                            </w:rPr>
-                            <w:t>KURANG MEMUASKAN</w:t>
-                          </w:r>
-                          <w:r>
-                            <w:rPr>
-                              <w:rFonts w:ascii="Calibri" w:eastAsia="Calibri" w:hAnsi="Calibri" w:cs="Calibri"/>
-                              <w:color w:val="585858"/>
-                              <w:sz w:val="18"/>
-                            </w:rPr>
-                            <w:tab/>
-                          </w:r>
-                          <w:r>
-                            <w:rPr>
-                              <w:rFonts w:ascii="Calibri" w:eastAsia="Calibri" w:hAnsi="Calibri" w:cs="Calibri"/>
-                              <w:color w:val="404040"/>
-                              <w:sz w:val="18"/>
-                            </w:rPr>
-                            <w:t>0%</w:t>
-                          </w:r>
-                        </w:p>
-                      </w:txbxContent>
-                    </v:textbox>
-                  </v:rect>
-                  <v:rect id="Rectangle 1337951336" o:spid="_x0000_s1041" style="position:absolute;left:2141;top:23246;width:18637;height:4744;visibility:visible;mso-wrap-style:square;v-text-anchor:top" o:gfxdata="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" filled="f" stroked="f">
-                    <v:textbox inset="0,0,0,0">
-                      <w:txbxContent>
-                        <w:p>
-                          <w:pPr>
-                            <w:spacing w:line="192" w:lineRule="auto"/>
-                            <w:textDirection w:val="btLr"/>
-                          </w:pPr>
-                          <w:r>
-                            <w:rPr>
-                              <w:rFonts w:ascii="Calibri" w:eastAsia="Calibri" w:hAnsi="Calibri" w:cs="Calibri"/>
-                              <w:color w:val="585858"/>
-                              <w:sz w:val="18"/>
-                            </w:rPr>
-                            <w:t>TIDAK MEMUASKAN</w:t>
-                          </w:r>
-                          <w:r>
-                            <w:rPr>
-                              <w:rFonts w:ascii="Calibri" w:eastAsia="Calibri" w:hAnsi="Calibri" w:cs="Calibri"/>
-                              <w:color w:val="585858"/>
-                              <w:sz w:val="18"/>
-                            </w:rPr>
-                            <w:tab/>
-                          </w:r>
-                          <w:r>
-                            <w:rPr>
-                              <w:rFonts w:ascii="Calibri" w:eastAsia="Calibri" w:hAnsi="Calibri" w:cs="Calibri"/>
-                              <w:color w:val="404040"/>
-                              <w:sz w:val="18"/>
-                            </w:rPr>
-                            <w:t>0%</w:t>
-                          </w:r>
-                        </w:p>
-                        <w:p>
-                          <w:pPr>
-                            <w:spacing w:before="116"/>
-                            <w:textDirection w:val="btLr"/>
-                          </w:pPr>
-                        </w:p>
-                        <w:p>
-                          <w:pPr>
-                            <w:spacing w:line="215" w:lineRule="auto"/>
-                            <w:ind w:left="1436" w:firstLine="1436"/>
-                            <w:textDirection w:val="btLr"/>
-                          </w:pPr>
-                          <w:r>
-                            <w:rPr>
-                              <w:rFonts w:ascii="Calibri" w:eastAsia="Calibri" w:hAnsi="Calibri" w:cs="Calibri"/>
-                              <w:color w:val="585858"/>
-                              <w:sz w:val="18"/>
-                            </w:rPr>
-                            <w:t>0.00%</w:t>
-                          </w:r>
-                          <w:r>
-                            <w:rPr>
-                              <w:rFonts w:ascii="Calibri" w:eastAsia="Calibri" w:hAnsi="Calibri" w:cs="Calibri"/>
-                              <w:color w:val="585858"/>
-                              <w:sz w:val="18"/>
-                            </w:rPr>
-                            <w:tab/>
-                            <w:t>10.00%</w:t>
-                          </w:r>
-                        </w:p>
-                      </w:txbxContent>
-                    </v:textbox>
-                  </v:rect>
-                  <v:rect id="Rectangle 2038623748" o:spid="_x0000_s1042" style="position:absolute;left:23465;top:26845;width:9798;height:1143;visibility:visible;mso-wrap-style:square;v-text-anchor:top" o:gfxdata="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" filled="f" stroked="f">
-                    <v:textbox inset="0,0,0,0">
-                      <w:txbxContent>
-                        <w:p>
-                          <w:pPr>
-                            <w:spacing w:line="180" w:lineRule="auto"/>
-                            <w:textDirection w:val="btLr"/>
-                          </w:pPr>
-                          <w:r>
-                            <w:rPr>
-                              <w:rFonts w:ascii="Calibri" w:eastAsia="Calibri" w:hAnsi="Calibri" w:cs="Calibri"/>
-                              <w:color w:val="585858"/>
-                              <w:sz w:val="18"/>
-                            </w:rPr>
-                            <w:t>20.00%</w:t>
-                          </w:r>
-                          <w:r>
-                            <w:rPr>
-                              <w:rFonts w:ascii="Calibri" w:eastAsia="Calibri" w:hAnsi="Calibri" w:cs="Calibri"/>
-                              <w:color w:val="585858"/>
-                              <w:sz w:val="18"/>
-                            </w:rPr>
-                            <w:tab/>
-                            <w:t>30.00%</w:t>
-                          </w:r>
-                        </w:p>
-                      </w:txbxContent>
-                    </v:textbox>
-                  </v:rect>
-                  <v:rect id="Rectangle 867845957" o:spid="_x0000_s1043" style="position:absolute;left:35950;top:26845;width:3556;height:1143;visibility:visible;mso-wrap-style:square;v-text-anchor:top" o:gfxdata="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" filled="f" stroked="f">
-                    <v:textbox inset="0,0,0,0">
-                      <w:txbxContent>
-                        <w:p>
-                          <w:pPr>
-                            <w:spacing w:line="180" w:lineRule="auto"/>
-                            <w:textDirection w:val="btLr"/>
-                          </w:pPr>
-                          <w:r>
-                            <w:rPr>
-                              <w:rFonts w:ascii="Calibri" w:eastAsia="Calibri" w:hAnsi="Calibri" w:cs="Calibri"/>
-                              <w:color w:val="585858"/>
-                              <w:sz w:val="18"/>
-                            </w:rPr>
-                            <w:t>40.00%</w:t>
-                          </w:r>
-                        </w:p>
-                      </w:txbxContent>
-                    </v:textbox>
-                  </v:rect>
-                  <v:rect id="Rectangle 893660851" o:spid="_x0000_s1044" style="position:absolute;left:42192;top:26845;width:3556;height:1143;visibility:visible;mso-wrap-style:square;v-text-anchor:top" o:gfxdata="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" filled="f" stroked="f">
-                    <v:textbox inset="0,0,0,0">
-                      <w:txbxContent>
-                        <w:p>
-                          <w:pPr>
-                            <w:spacing w:line="180" w:lineRule="auto"/>
-                            <w:textDirection w:val="btLr"/>
-                          </w:pPr>
-                          <w:r>
-                            <w:rPr>
-                              <w:rFonts w:ascii="Calibri" w:eastAsia="Calibri" w:hAnsi="Calibri" w:cs="Calibri"/>
-                              <w:color w:val="585858"/>
-                              <w:sz w:val="18"/>
-                            </w:rPr>
-                            <w:t>50.00%</w:t>
-                          </w:r>
-                        </w:p>
-                      </w:txbxContent>
-                    </v:textbox>
-                  </v:rect>
-                  <v:rect id="Rectangle 1487334765" o:spid="_x0000_s1045" style="position:absolute;left:48434;top:26845;width:3556;height:1143;visibility:visible;mso-wrap-style:square;v-text-anchor:top" o:gfxdata="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" filled="f" stroked="f">
-                    <v:textbox inset="0,0,0,0">
-                      <w:txbxContent>
-                        <w:p>
-                          <w:pPr>
-                            <w:spacing w:line="180" w:lineRule="auto"/>
-                            <w:textDirection w:val="btLr"/>
-                          </w:pPr>
-                          <w:r>
-                            <w:rPr>
-                              <w:rFonts w:ascii="Calibri" w:eastAsia="Calibri" w:hAnsi="Calibri" w:cs="Calibri"/>
-                              <w:color w:val="585858"/>
-                              <w:sz w:val="18"/>
-                            </w:rPr>
-                            <w:t>60.00%</w:t>
-                          </w:r>
-                        </w:p>
-                      </w:txbxContent>
-                    </v:textbox>
-                  </v:rect>
-                  <v:rect id="Rectangle 745270486" o:spid="_x0000_s1046" style="position:absolute;left:54676;top:26845;width:3556;height:1143;visibility:visible;mso-wrap-style:square;v-text-anchor:top" o:gfxdata="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" filled="f" stroked="f">
-                    <v:textbox inset="0,0,0,0">
-                      <w:txbxContent>
-                        <w:p>
-                          <w:pPr>
-                            <w:spacing w:line="180" w:lineRule="auto"/>
-                            <w:textDirection w:val="btLr"/>
-                          </w:pPr>
-                          <w:r>
-                            <w:rPr>
-                              <w:rFonts w:ascii="Calibri" w:eastAsia="Calibri" w:hAnsi="Calibri" w:cs="Calibri"/>
-                              <w:color w:val="585858"/>
-                              <w:sz w:val="18"/>
-                            </w:rPr>
-                            <w:t>70.00%</w:t>
-                          </w:r>
-                        </w:p>
-                      </w:txbxContent>
-                    </v:textbox>
-                  </v:rect>
-                  <v:rect id="Rectangle 2087903911" o:spid="_x0000_s1047" style="position:absolute;left:28324;top:35517;width:4375;height:1143;visibility:visible;mso-wrap-style:square;v-text-anchor:top" o:gfxdata="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" filled="f" stroked="f">
-                    <v:textbox inset="0,0,0,0">
-                      <w:txbxContent>
-                        <w:p>
-                          <w:pPr>
-                            <w:spacing w:line="180" w:lineRule="auto"/>
-                            <w:textDirection w:val="btLr"/>
-                          </w:pPr>
-                          <w:r>
-                            <w:rPr>
-                              <w:rFonts w:ascii="Calibri" w:eastAsia="Calibri" w:hAnsi="Calibri" w:cs="Calibri"/>
-                              <w:color w:val="585858"/>
-                              <w:sz w:val="18"/>
-                            </w:rPr>
-                            <w:t>PERATUS</w:t>
-                          </w:r>
-                        </w:p>
-                      </w:txbxContent>
-                    </v:textbox>
-                  </v:rect>
-                </v:group>
-                <w10:wrap anchorx="page" anchory="page"/>
-              </v:group>
-            </w:pict>
-          </mc:Fallback>
-        </mc:AlternateContent>
-      </w:r>
     </w:p>
     <w:p>
       <w:pPr>
@@ -23387,15 +21900,6 @@
                 <w:szCs w:val="18"/>
               </w:rPr>
             </w:pPr>
-            <w:r>
-              <w:rPr>
-                <w:rFonts w:ascii="Calibri" w:eastAsia="Calibri" w:hAnsi="Calibri" w:cs="Calibri"/>
-                <w:color w:val="585858"/>
-                <w:sz w:val="18"/>
-                <w:szCs w:val="18"/>
-              </w:rPr>
-              <w:t>0.00%</w:t>
-            </w:r>
           </w:p>
         </w:tc>
         <w:tc>
@@ -23421,15 +21925,6 @@
                 <w:szCs w:val="18"/>
               </w:rPr>
             </w:pPr>
-            <w:r>
-              <w:rPr>
-                <w:rFonts w:ascii="Calibri" w:eastAsia="Calibri" w:hAnsi="Calibri" w:cs="Calibri"/>
-                <w:color w:val="585858"/>
-                <w:sz w:val="18"/>
-                <w:szCs w:val="18"/>
-              </w:rPr>
-              <w:t>0.00%</w:t>
-            </w:r>
           </w:p>
         </w:tc>
         <w:tc>
@@ -23455,15 +21950,6 @@
                 <w:szCs w:val="18"/>
               </w:rPr>
             </w:pPr>
-            <w:r>
-              <w:rPr>
-                <w:rFonts w:ascii="Calibri" w:eastAsia="Calibri" w:hAnsi="Calibri" w:cs="Calibri"/>
-                <w:color w:val="585858"/>
-                <w:sz w:val="18"/>
-                <w:szCs w:val="18"/>
-              </w:rPr>
-              <w:t>0.00%</w:t>
-            </w:r>
           </w:p>
         </w:tc>
         <w:tc>
@@ -23489,15 +21975,6 @@
                 <w:szCs w:val="18"/>
               </w:rPr>
             </w:pPr>
-            <w:r>
-              <w:rPr>
-                <w:rFonts w:ascii="Calibri" w:eastAsia="Calibri" w:hAnsi="Calibri" w:cs="Calibri"/>
-                <w:color w:val="585858"/>
-                <w:sz w:val="18"/>
-                <w:szCs w:val="18"/>
-              </w:rPr>
-              <w:t>33.33%</w:t>
-            </w:r>
           </w:p>
         </w:tc>
         <w:tc>
@@ -23523,15 +22000,6 @@
                 <w:szCs w:val="18"/>
               </w:rPr>
             </w:pPr>
-            <w:r>
-              <w:rPr>
-                <w:rFonts w:ascii="Calibri" w:eastAsia="Calibri" w:hAnsi="Calibri" w:cs="Calibri"/>
-                <w:color w:val="585858"/>
-                <w:sz w:val="18"/>
-                <w:szCs w:val="18"/>
-              </w:rPr>
-              <w:t>66.67%</w:t>
-            </w:r>
           </w:p>
         </w:tc>
       </w:tr>
@@ -24062,14 +22530,6 @@
                 <w:color w:val="000000"/>
               </w:rPr>
             </w:pPr>
-            <w:r>
-              <w:rPr>
-                <w:rFonts w:ascii="Calibri" w:eastAsia="Calibri" w:hAnsi="Calibri" w:cs="Calibri"/>
-                <w:b/>
-                <w:color w:val="000000"/>
-              </w:rPr>
-              <w:t>0</w:t>
-            </w:r>
           </w:p>
         </w:tc>
         <w:tc>
@@ -24098,13 +22558,6 @@
                 <w:color w:val="000000"/>
               </w:rPr>
             </w:pPr>
-            <w:r>
-              <w:rPr>
-                <w:rFonts w:ascii="Trebuchet MS" w:eastAsia="Trebuchet MS" w:hAnsi="Trebuchet MS" w:cs="Trebuchet MS"/>
-                <w:color w:val="000000"/>
-              </w:rPr>
-              <w:t>0</w:t>
-            </w:r>
           </w:p>
         </w:tc>
         <w:tc>
@@ -24133,13 +22586,6 @@
                 <w:color w:val="000000"/>
               </w:rPr>
             </w:pPr>
-            <w:r>
-              <w:rPr>
-                <w:rFonts w:ascii="Trebuchet MS" w:eastAsia="Trebuchet MS" w:hAnsi="Trebuchet MS" w:cs="Trebuchet MS"/>
-                <w:color w:val="000000"/>
-              </w:rPr>
-              <w:t>0</w:t>
-            </w:r>
           </w:p>
         </w:tc>
         <w:tc>
@@ -24168,13 +22614,6 @@
                 <w:color w:val="000000"/>
               </w:rPr>
             </w:pPr>
-            <w:r>
-              <w:rPr>
-                <w:rFonts w:ascii="Trebuchet MS" w:eastAsia="Trebuchet MS" w:hAnsi="Trebuchet MS" w:cs="Trebuchet MS"/>
-                <w:color w:val="000000"/>
-              </w:rPr>
-              <w:t>10</w:t>
-            </w:r>
           </w:p>
         </w:tc>
         <w:tc>
@@ -24202,13 +22641,6 @@
                 <w:color w:val="000000"/>
               </w:rPr>
             </w:pPr>
-            <w:r>
-              <w:rPr>
-                <w:rFonts w:ascii="Trebuchet MS" w:eastAsia="Trebuchet MS" w:hAnsi="Trebuchet MS" w:cs="Trebuchet MS"/>
-                <w:color w:val="000000"/>
-              </w:rPr>
-              <w:t>20</w:t>
-            </w:r>
           </w:p>
         </w:tc>
       </w:tr>
@@ -24236,12 +22668,6 @@
                 <w:color w:val="000000"/>
               </w:rPr>
             </w:pPr>
-            <w:r>
-              <w:rPr>
-                <w:color w:val="000000"/>
-              </w:rPr>
-              <w:t>0.00%</w:t>
-            </w:r>
           </w:p>
         </w:tc>
         <w:tc>
@@ -24264,12 +22690,6 @@
                 <w:color w:val="000000"/>
               </w:rPr>
             </w:pPr>
-            <w:r>
-              <w:rPr>
-                <w:color w:val="000000"/>
-              </w:rPr>
-              <w:t>0.00%</w:t>
-            </w:r>
           </w:p>
         </w:tc>
         <w:tc>
@@ -24292,12 +22712,6 @@
                 <w:color w:val="000000"/>
               </w:rPr>
             </w:pPr>
-            <w:r>
-              <w:rPr>
-                <w:color w:val="000000"/>
-              </w:rPr>
-              <w:t>0.00%</w:t>
-            </w:r>
           </w:p>
         </w:tc>
         <w:tc>
@@ -24320,12 +22734,6 @@
                 <w:color w:val="000000"/>
               </w:rPr>
             </w:pPr>
-            <w:r>
-              <w:rPr>
-                <w:color w:val="000000"/>
-              </w:rPr>
-              <w:t>33.33%</w:t>
-            </w:r>
           </w:p>
         </w:tc>
         <w:tc>
@@ -24348,12 +22756,6 @@
                 <w:color w:val="000000"/>
               </w:rPr>
             </w:pPr>
-            <w:r>
-              <w:rPr>
-                <w:color w:val="000000"/>
-              </w:rPr>
-              <w:t>66.67%</w:t>
-            </w:r>
           </w:p>
         </w:tc>
       </w:tr>
@@ -24538,15 +22940,7 @@
           <w:sz w:val="24"/>
           <w:szCs w:val="24"/>
         </w:rPr>
-        <w:t>. Ini membuktikan penganjuran kursus ini memberikan manfaat kepa</w:t>
-      </w:r>
-      <w:r>
-        <w:rPr>
-          <w:color w:val="000000"/>
-          <w:sz w:val="24"/>
-          <w:szCs w:val="24"/>
-        </w:rPr>
-        <w:t xml:space="preserve">da mereka </w:t>
+        <w:t xml:space="preserve">. Ini membuktikan penganjuran kursus ini memberikan manfaat kepada mereka </w:t>
       </w:r>
       <w:proofErr w:type="spellStart"/>
       <w:r>
@@ -27125,1574 +25519,6 @@
         </w:rPr>
         <w:t xml:space="preserve"> Usrah selama 2 hari. Skor yang dicapai oleh setiap individu berbeza-beza, ada yang menunjukkan peningkatan, penurunan dan tiada perubahan/ peningkatan. Keputusan yang telah diperolehi adalah seperti rajah berikut:</w:t>
       </w:r>
-      <w:r>
-        <w:rPr>
-          <w:noProof/>
-        </w:rPr>
-        <mc:AlternateContent>
-          <mc:Choice Requires="wpg">
-            <w:drawing>
-              <wp:anchor distT="0" distB="0" distL="0" distR="0" simplePos="0" relativeHeight="251661312" behindDoc="1" locked="0" layoutInCell="1" hidden="0" allowOverlap="1" wp14:anchorId="523111CB" wp14:editId="523111CC">
-                <wp:simplePos x="0" y="0"/>
-                <wp:positionH relativeFrom="column">
-                  <wp:posOffset>681037</wp:posOffset>
-                </wp:positionH>
-                <wp:positionV relativeFrom="paragraph">
-                  <wp:posOffset>1309008</wp:posOffset>
-                </wp:positionV>
-                <wp:extent cx="5754370" cy="2700020"/>
-                <wp:effectExtent l="0" t="0" r="0" b="0"/>
-                <wp:wrapNone/>
-                <wp:docPr id="11" name="Group 11"/>
-                <wp:cNvGraphicFramePr/>
-                <a:graphic xmlns:a="http://schemas.openxmlformats.org/drawingml/2006/main">
-                  <a:graphicData uri="http://schemas.microsoft.com/office/word/2010/wordprocessingGroup">
-                    <wpg:wgp>
-                      <wpg:cNvGrpSpPr/>
-                      <wpg:grpSpPr>
-                        <a:xfrm>
-                          <a:off x="0" y="0"/>
-                          <a:ext cx="5754370" cy="2700020"/>
-                          <a:chOff x="2468800" y="2429975"/>
-                          <a:chExt cx="5754400" cy="2700050"/>
-                        </a:xfrm>
-                      </wpg:grpSpPr>
-                      <wpg:grpSp>
-                        <wpg:cNvPr id="1220319413" name="Group 1220319413"/>
-                        <wpg:cNvGrpSpPr/>
-                        <wpg:grpSpPr>
-                          <a:xfrm>
-                            <a:off x="2468815" y="2429990"/>
-                            <a:ext cx="5754350" cy="2700000"/>
-                            <a:chOff x="0" y="0"/>
-                            <a:chExt cx="5754350" cy="2700000"/>
-                          </a:xfrm>
-                        </wpg:grpSpPr>
-                        <wps:wsp>
-                          <wps:cNvPr id="1730733413" name="Rectangle 1730733413"/>
-                          <wps:cNvSpPr/>
-                          <wps:spPr>
-                            <a:xfrm>
-                              <a:off x="0" y="0"/>
-                              <a:ext cx="5754350" cy="2700000"/>
-                            </a:xfrm>
-                            <a:prstGeom prst="rect">
-                              <a:avLst/>
-                            </a:prstGeom>
-                            <a:noFill/>
-                            <a:ln>
-                              <a:noFill/>
-                            </a:ln>
-                          </wps:spPr>
-                          <wps:txbx>
-                            <w:txbxContent>
-                              <w:p>
-                                <w:pPr>
-                                  <w:textDirection w:val="btLr"/>
-                                </w:pPr>
-                              </w:p>
-                            </w:txbxContent>
-                          </wps:txbx>
-                          <wps:bodyPr spcFirstLastPara="1" wrap="square" lIns="91425" tIns="91425" rIns="91425" bIns="91425" anchor="ctr" anchorCtr="0">
-                            <a:noAutofit/>
-                          </wps:bodyPr>
-                        </wps:wsp>
-                        <wps:wsp>
-                          <wps:cNvPr id="1326562656" name="Freeform: Shape 1326562656"/>
-                          <wps:cNvSpPr/>
-                          <wps:spPr>
-                            <a:xfrm>
-                              <a:off x="1798510" y="475805"/>
-                              <a:ext cx="3640454" cy="1160145"/>
-                            </a:xfrm>
-                            <a:custGeom>
-                              <a:avLst/>
-                              <a:gdLst/>
-                              <a:ahLst/>
-                              <a:cxnLst/>
-                              <a:rect l="l" t="t" r="r" b="b"/>
-                              <a:pathLst>
-                                <a:path w="3640454" h="1160145" extrusionOk="0">
-                                  <a:moveTo>
-                                    <a:pt x="0" y="776478"/>
-                                  </a:moveTo>
-                                  <a:lnTo>
-                                    <a:pt x="0" y="963930"/>
-                                  </a:lnTo>
-                                </a:path>
-                                <a:path w="3640454" h="1160145" extrusionOk="0">
-                                  <a:moveTo>
-                                    <a:pt x="0" y="486918"/>
-                                  </a:moveTo>
-                                  <a:lnTo>
-                                    <a:pt x="0" y="672846"/>
-                                  </a:lnTo>
-                                </a:path>
-                                <a:path w="3640454" h="1160145" extrusionOk="0">
-                                  <a:moveTo>
-                                    <a:pt x="0" y="0"/>
-                                  </a:moveTo>
-                                  <a:lnTo>
-                                    <a:pt x="0" y="383286"/>
-                                  </a:lnTo>
-                                </a:path>
-                                <a:path w="3640454" h="1160145" extrusionOk="0">
-                                  <a:moveTo>
-                                    <a:pt x="0" y="1066038"/>
-                                  </a:moveTo>
-                                  <a:lnTo>
-                                    <a:pt x="0" y="1160018"/>
-                                  </a:lnTo>
-                                </a:path>
-                                <a:path w="3640454" h="1160145" extrusionOk="0">
-                                  <a:moveTo>
-                                    <a:pt x="606551" y="486918"/>
-                                  </a:moveTo>
-                                  <a:lnTo>
-                                    <a:pt x="606551" y="1160018"/>
-                                  </a:lnTo>
-                                </a:path>
-                                <a:path w="3640454" h="1160145" extrusionOk="0">
-                                  <a:moveTo>
-                                    <a:pt x="606551" y="0"/>
-                                  </a:moveTo>
-                                  <a:lnTo>
-                                    <a:pt x="606551" y="383286"/>
-                                  </a:lnTo>
-                                </a:path>
-                                <a:path w="3640454" h="1160145" extrusionOk="0">
-                                  <a:moveTo>
-                                    <a:pt x="1213103" y="486918"/>
-                                  </a:moveTo>
-                                  <a:lnTo>
-                                    <a:pt x="1213103" y="1160018"/>
-                                  </a:lnTo>
-                                </a:path>
-                                <a:path w="3640454" h="1160145" extrusionOk="0">
-                                  <a:moveTo>
-                                    <a:pt x="1213103" y="0"/>
-                                  </a:moveTo>
-                                  <a:lnTo>
-                                    <a:pt x="1213103" y="383286"/>
-                                  </a:lnTo>
-                                </a:path>
-                                <a:path w="3640454" h="1160145" extrusionOk="0">
-                                  <a:moveTo>
-                                    <a:pt x="1819655" y="486918"/>
-                                  </a:moveTo>
-                                  <a:lnTo>
-                                    <a:pt x="1819655" y="1160018"/>
-                                  </a:lnTo>
-                                </a:path>
-                                <a:path w="3640454" h="1160145" extrusionOk="0">
-                                  <a:moveTo>
-                                    <a:pt x="1819655" y="0"/>
-                                  </a:moveTo>
-                                  <a:lnTo>
-                                    <a:pt x="1819655" y="383286"/>
-                                  </a:lnTo>
-                                </a:path>
-                                <a:path w="3640454" h="1160145" extrusionOk="0">
-                                  <a:moveTo>
-                                    <a:pt x="2426207" y="486918"/>
-                                  </a:moveTo>
-                                  <a:lnTo>
-                                    <a:pt x="2426207" y="1160018"/>
-                                  </a:lnTo>
-                                </a:path>
-                                <a:path w="3640454" h="1160145" extrusionOk="0">
-                                  <a:moveTo>
-                                    <a:pt x="2426207" y="0"/>
-                                  </a:moveTo>
-                                  <a:lnTo>
-                                    <a:pt x="2426207" y="383286"/>
-                                  </a:lnTo>
-                                </a:path>
-                                <a:path w="3640454" h="1160145" extrusionOk="0">
-                                  <a:moveTo>
-                                    <a:pt x="3032760" y="486918"/>
-                                  </a:moveTo>
-                                  <a:lnTo>
-                                    <a:pt x="3032760" y="1160018"/>
-                                  </a:lnTo>
-                                </a:path>
-                                <a:path w="3640454" h="1160145" extrusionOk="0">
-                                  <a:moveTo>
-                                    <a:pt x="3032760" y="0"/>
-                                  </a:moveTo>
-                                  <a:lnTo>
-                                    <a:pt x="3032760" y="383286"/>
-                                  </a:lnTo>
-                                </a:path>
-                                <a:path w="3640454" h="1160145" extrusionOk="0">
-                                  <a:moveTo>
-                                    <a:pt x="3640328" y="0"/>
-                                  </a:moveTo>
-                                  <a:lnTo>
-                                    <a:pt x="3640328" y="1160018"/>
-                                  </a:lnTo>
-                                </a:path>
-                              </a:pathLst>
-                            </a:custGeom>
-                            <a:noFill/>
-                            <a:ln w="9525" cap="flat" cmpd="sng">
-                              <a:solidFill>
-                                <a:srgbClr val="D9D9D9"/>
-                              </a:solidFill>
-                              <a:prstDash val="solid"/>
-                              <a:round/>
-                              <a:headEnd type="none" w="sm" len="sm"/>
-                              <a:tailEnd type="none" w="sm" len="sm"/>
-                            </a:ln>
-                          </wps:spPr>
-                          <wps:bodyPr spcFirstLastPara="1" wrap="square" lIns="91425" tIns="91425" rIns="91425" bIns="91425" anchor="ctr" anchorCtr="0">
-                            <a:noAutofit/>
-                          </wps:bodyPr>
-                        </wps:wsp>
-                        <wps:wsp>
-                          <wps:cNvPr id="1035940670" name="Freeform: Shape 1035940670"/>
-                          <wps:cNvSpPr/>
-                          <wps:spPr>
-                            <a:xfrm>
-                              <a:off x="1190942" y="569531"/>
-                              <a:ext cx="3982085" cy="972819"/>
-                            </a:xfrm>
-                            <a:custGeom>
-                              <a:avLst/>
-                              <a:gdLst/>
-                              <a:ahLst/>
-                              <a:cxnLst/>
-                              <a:rect l="l" t="t" r="r" b="b"/>
-                              <a:pathLst>
-                                <a:path w="3982085" h="972819" extrusionOk="0">
-                                  <a:moveTo>
-                                    <a:pt x="378968" y="0"/>
-                                  </a:moveTo>
-                                  <a:lnTo>
-                                    <a:pt x="0" y="0"/>
-                                  </a:lnTo>
-                                  <a:lnTo>
-                                    <a:pt x="0" y="102108"/>
-                                  </a:lnTo>
-                                  <a:lnTo>
-                                    <a:pt x="378968" y="102108"/>
-                                  </a:lnTo>
-                                  <a:lnTo>
-                                    <a:pt x="378968" y="0"/>
-                                  </a:lnTo>
-                                  <a:close/>
-                                </a:path>
-                                <a:path w="3982085" h="972819" extrusionOk="0">
-                                  <a:moveTo>
-                                    <a:pt x="758444" y="579120"/>
-                                  </a:moveTo>
-                                  <a:lnTo>
-                                    <a:pt x="0" y="579120"/>
-                                  </a:lnTo>
-                                  <a:lnTo>
-                                    <a:pt x="0" y="682752"/>
-                                  </a:lnTo>
-                                  <a:lnTo>
-                                    <a:pt x="758444" y="682752"/>
-                                  </a:lnTo>
-                                  <a:lnTo>
-                                    <a:pt x="758444" y="579120"/>
-                                  </a:lnTo>
-                                  <a:close/>
-                                </a:path>
-                                <a:path w="3982085" h="972819" extrusionOk="0">
-                                  <a:moveTo>
-                                    <a:pt x="947420" y="870204"/>
-                                  </a:moveTo>
-                                  <a:lnTo>
-                                    <a:pt x="0" y="870204"/>
-                                  </a:lnTo>
-                                  <a:lnTo>
-                                    <a:pt x="0" y="972312"/>
-                                  </a:lnTo>
-                                  <a:lnTo>
-                                    <a:pt x="947420" y="972312"/>
-                                  </a:lnTo>
-                                  <a:lnTo>
-                                    <a:pt x="947420" y="870204"/>
-                                  </a:lnTo>
-                                  <a:close/>
-                                </a:path>
-                                <a:path w="3982085" h="972819" extrusionOk="0">
-                                  <a:moveTo>
-                                    <a:pt x="3981704" y="289560"/>
-                                  </a:moveTo>
-                                  <a:lnTo>
-                                    <a:pt x="0" y="289560"/>
-                                  </a:lnTo>
-                                  <a:lnTo>
-                                    <a:pt x="0" y="393192"/>
-                                  </a:lnTo>
-                                  <a:lnTo>
-                                    <a:pt x="3981704" y="393192"/>
-                                  </a:lnTo>
-                                  <a:lnTo>
-                                    <a:pt x="3981704" y="289560"/>
-                                  </a:lnTo>
-                                  <a:close/>
-                                </a:path>
-                              </a:pathLst>
-                            </a:custGeom>
-                            <a:solidFill>
-                              <a:srgbClr val="EC7C30"/>
-                            </a:solidFill>
-                            <a:ln>
-                              <a:noFill/>
-                            </a:ln>
-                          </wps:spPr>
-                          <wps:bodyPr spcFirstLastPara="1" wrap="square" lIns="91425" tIns="91425" rIns="91425" bIns="91425" anchor="ctr" anchorCtr="0">
-                            <a:noAutofit/>
-                          </wps:bodyPr>
-                        </wps:wsp>
-                        <wps:wsp>
-                          <wps:cNvPr id="171501731" name="Freeform: Shape 171501731"/>
-                          <wps:cNvSpPr/>
-                          <wps:spPr>
-                            <a:xfrm>
-                              <a:off x="1190942" y="475805"/>
-                              <a:ext cx="1270" cy="1160145"/>
-                            </a:xfrm>
-                            <a:custGeom>
-                              <a:avLst/>
-                              <a:gdLst/>
-                              <a:ahLst/>
-                              <a:cxnLst/>
-                              <a:rect l="l" t="t" r="r" b="b"/>
-                              <a:pathLst>
-                                <a:path w="120000" h="1160145" extrusionOk="0">
-                                  <a:moveTo>
-                                    <a:pt x="0" y="1160018"/>
-                                  </a:moveTo>
-                                  <a:lnTo>
-                                    <a:pt x="0" y="0"/>
-                                  </a:lnTo>
-                                </a:path>
-                              </a:pathLst>
-                            </a:custGeom>
-                            <a:noFill/>
-                            <a:ln w="9525" cap="flat" cmpd="sng">
-                              <a:solidFill>
-                                <a:srgbClr val="D9D9D9"/>
-                              </a:solidFill>
-                              <a:prstDash val="solid"/>
-                              <a:round/>
-                              <a:headEnd type="none" w="sm" len="sm"/>
-                              <a:tailEnd type="none" w="sm" len="sm"/>
-                            </a:ln>
-                          </wps:spPr>
-                          <wps:bodyPr spcFirstLastPara="1" wrap="square" lIns="91425" tIns="91425" rIns="91425" bIns="91425" anchor="ctr" anchorCtr="0">
-                            <a:noAutofit/>
-                          </wps:bodyPr>
-                        </wps:wsp>
-                        <wps:wsp>
-                          <wps:cNvPr id="710555192" name="Freeform: Shape 710555192"/>
-                          <wps:cNvSpPr/>
-                          <wps:spPr>
-                            <a:xfrm>
-                              <a:off x="185381" y="2139340"/>
-                              <a:ext cx="2520950" cy="404495"/>
-                            </a:xfrm>
-                            <a:custGeom>
-                              <a:avLst/>
-                              <a:gdLst/>
-                              <a:ahLst/>
-                              <a:cxnLst/>
-                              <a:rect l="l" t="t" r="r" b="b"/>
-                              <a:pathLst>
-                                <a:path w="2520950" h="404495" extrusionOk="0">
-                                  <a:moveTo>
-                                    <a:pt x="62776" y="0"/>
-                                  </a:moveTo>
-                                  <a:lnTo>
-                                    <a:pt x="0" y="0"/>
-                                  </a:lnTo>
-                                  <a:lnTo>
-                                    <a:pt x="0" y="62776"/>
-                                  </a:lnTo>
-                                  <a:lnTo>
-                                    <a:pt x="62776" y="62776"/>
-                                  </a:lnTo>
-                                  <a:lnTo>
-                                    <a:pt x="62776" y="0"/>
-                                  </a:lnTo>
-                                  <a:close/>
-                                </a:path>
-                                <a:path w="2520950" h="404495" extrusionOk="0">
-                                  <a:moveTo>
-                                    <a:pt x="2520454" y="341122"/>
-                                  </a:moveTo>
-                                  <a:lnTo>
-                                    <a:pt x="2457678" y="341122"/>
-                                  </a:lnTo>
-                                  <a:lnTo>
-                                    <a:pt x="2457678" y="403898"/>
-                                  </a:lnTo>
-                                  <a:lnTo>
-                                    <a:pt x="2520454" y="403898"/>
-                                  </a:lnTo>
-                                  <a:lnTo>
-                                    <a:pt x="2520454" y="341122"/>
-                                  </a:lnTo>
-                                  <a:close/>
-                                </a:path>
-                              </a:pathLst>
-                            </a:custGeom>
-                            <a:solidFill>
-                              <a:srgbClr val="EC7C30"/>
-                            </a:solidFill>
-                            <a:ln>
-                              <a:noFill/>
-                            </a:ln>
-                          </wps:spPr>
-                          <wps:bodyPr spcFirstLastPara="1" wrap="square" lIns="91425" tIns="91425" rIns="91425" bIns="91425" anchor="ctr" anchorCtr="0">
-                            <a:noAutofit/>
-                          </wps:bodyPr>
-                        </wps:wsp>
-                        <wps:wsp>
-                          <wps:cNvPr id="1759403382" name="Freeform: Shape 1759403382"/>
-                          <wps:cNvSpPr/>
-                          <wps:spPr>
-                            <a:xfrm>
-                              <a:off x="4762" y="4762"/>
-                              <a:ext cx="5744845" cy="2690495"/>
-                            </a:xfrm>
-                            <a:custGeom>
-                              <a:avLst/>
-                              <a:gdLst/>
-                              <a:ahLst/>
-                              <a:cxnLst/>
-                              <a:rect l="l" t="t" r="r" b="b"/>
-                              <a:pathLst>
-                                <a:path w="5744845" h="2690495" extrusionOk="0">
-                                  <a:moveTo>
-                                    <a:pt x="0" y="2690494"/>
-                                  </a:moveTo>
-                                  <a:lnTo>
-                                    <a:pt x="5744845" y="2690494"/>
-                                  </a:lnTo>
-                                  <a:lnTo>
-                                    <a:pt x="5744845" y="0"/>
-                                  </a:lnTo>
-                                  <a:lnTo>
-                                    <a:pt x="0" y="0"/>
-                                  </a:lnTo>
-                                  <a:lnTo>
-                                    <a:pt x="0" y="2690494"/>
-                                  </a:lnTo>
-                                  <a:close/>
-                                </a:path>
-                              </a:pathLst>
-                            </a:custGeom>
-                            <a:noFill/>
-                            <a:ln w="9525" cap="flat" cmpd="sng">
-                              <a:solidFill>
-                                <a:srgbClr val="D9D9D9"/>
-                              </a:solidFill>
-                              <a:prstDash val="solid"/>
-                              <a:round/>
-                              <a:headEnd type="none" w="sm" len="sm"/>
-                              <a:tailEnd type="none" w="sm" len="sm"/>
-                            </a:ln>
-                          </wps:spPr>
-                          <wps:bodyPr spcFirstLastPara="1" wrap="square" lIns="91425" tIns="91425" rIns="91425" bIns="91425" anchor="ctr" anchorCtr="0">
-                            <a:noAutofit/>
-                          </wps:bodyPr>
-                        </wps:wsp>
-                        <wps:wsp>
-                          <wps:cNvPr id="884807560" name="Rectangle 884807560"/>
-                          <wps:cNvSpPr/>
-                          <wps:spPr>
-                            <a:xfrm>
-                              <a:off x="1780476" y="135826"/>
-                              <a:ext cx="2211070" cy="178435"/>
-                            </a:xfrm>
-                            <a:prstGeom prst="rect">
-                              <a:avLst/>
-                            </a:prstGeom>
-                            <a:noFill/>
-                            <a:ln>
-                              <a:noFill/>
-                            </a:ln>
-                          </wps:spPr>
-                          <wps:txbx>
-                            <w:txbxContent>
-                              <w:p>
-                                <w:pPr>
-                                  <w:spacing w:line="281" w:lineRule="auto"/>
-                                  <w:textDirection w:val="btLr"/>
-                                </w:pPr>
-                                <w:r>
-                                  <w:rPr>
-                                    <w:rFonts w:ascii="Calibri" w:eastAsia="Calibri" w:hAnsi="Calibri" w:cs="Calibri"/>
-                                    <w:color w:val="585858"/>
-                                    <w:sz w:val="28"/>
-                                  </w:rPr>
-                                  <w:t>PERATUSAN SKOR PRA &amp; POST</w:t>
-                                </w:r>
-                              </w:p>
-                            </w:txbxContent>
-                          </wps:txbx>
-                          <wps:bodyPr spcFirstLastPara="1" wrap="square" lIns="0" tIns="0" rIns="0" bIns="0" anchor="t" anchorCtr="0">
-                            <a:noAutofit/>
-                          </wps:bodyPr>
-                        </wps:wsp>
-                        <wps:wsp>
-                          <wps:cNvPr id="1592117263" name="Rectangle 1592117263"/>
-                          <wps:cNvSpPr/>
-                          <wps:spPr>
-                            <a:xfrm>
-                              <a:off x="344614" y="567626"/>
-                              <a:ext cx="752475" cy="114300"/>
-                            </a:xfrm>
-                            <a:prstGeom prst="rect">
-                              <a:avLst/>
-                            </a:prstGeom>
-                            <a:noFill/>
-                            <a:ln>
-                              <a:noFill/>
-                            </a:ln>
-                          </wps:spPr>
-                          <wps:txbx>
-                            <w:txbxContent>
-                              <w:p>
-                                <w:pPr>
-                                  <w:spacing w:line="180" w:lineRule="auto"/>
-                                  <w:textDirection w:val="btLr"/>
-                                </w:pPr>
-                                <w:r>
-                                  <w:rPr>
-                                    <w:rFonts w:ascii="Calibri" w:eastAsia="Calibri" w:hAnsi="Calibri" w:cs="Calibri"/>
-                                    <w:color w:val="585858"/>
-                                    <w:sz w:val="18"/>
-                                  </w:rPr>
-                                  <w:t>TIDAK LENGKAP</w:t>
-                                </w:r>
-                              </w:p>
-                            </w:txbxContent>
-                          </wps:txbx>
-                          <wps:bodyPr spcFirstLastPara="1" wrap="square" lIns="0" tIns="0" rIns="0" bIns="0" anchor="t" anchorCtr="0">
-                            <a:noAutofit/>
-                          </wps:bodyPr>
-                        </wps:wsp>
-                        <wps:wsp>
-                          <wps:cNvPr id="1284594386" name="Rectangle 1284594386"/>
-                          <wps:cNvSpPr/>
-                          <wps:spPr>
-                            <a:xfrm>
-                              <a:off x="1645856" y="573976"/>
-                              <a:ext cx="297180" cy="114300"/>
-                            </a:xfrm>
-                            <a:prstGeom prst="rect">
-                              <a:avLst/>
-                            </a:prstGeom>
-                            <a:noFill/>
-                            <a:ln>
-                              <a:noFill/>
-                            </a:ln>
-                          </wps:spPr>
-                          <wps:txbx>
-                            <w:txbxContent>
-                              <w:p>
-                                <w:pPr>
-                                  <w:spacing w:line="180" w:lineRule="auto"/>
-                                  <w:textDirection w:val="btLr"/>
-                                </w:pPr>
-                                <w:r>
-                                  <w:rPr>
-                                    <w:rFonts w:ascii="Calibri" w:eastAsia="Calibri" w:hAnsi="Calibri" w:cs="Calibri"/>
-                                    <w:color w:val="404040"/>
-                                    <w:sz w:val="18"/>
-                                  </w:rPr>
-                                  <w:t>6.25%</w:t>
-                                </w:r>
-                              </w:p>
-                            </w:txbxContent>
-                          </wps:txbx>
-                          <wps:bodyPr spcFirstLastPara="1" wrap="square" lIns="0" tIns="0" rIns="0" bIns="0" anchor="t" anchorCtr="0">
-                            <a:noAutofit/>
-                          </wps:bodyPr>
-                        </wps:wsp>
-                        <wps:wsp>
-                          <wps:cNvPr id="350576295" name="Rectangle 350576295"/>
-                          <wps:cNvSpPr/>
-                          <wps:spPr>
-                            <a:xfrm>
-                              <a:off x="501840" y="857821"/>
-                              <a:ext cx="595630" cy="114300"/>
-                            </a:xfrm>
-                            <a:prstGeom prst="rect">
-                              <a:avLst/>
-                            </a:prstGeom>
-                            <a:noFill/>
-                            <a:ln>
-                              <a:noFill/>
-                            </a:ln>
-                          </wps:spPr>
-                          <wps:txbx>
-                            <w:txbxContent>
-                              <w:p>
-                                <w:pPr>
-                                  <w:spacing w:line="180" w:lineRule="auto"/>
-                                  <w:textDirection w:val="btLr"/>
-                                </w:pPr>
-                                <w:r>
-                                  <w:rPr>
-                                    <w:rFonts w:ascii="Calibri" w:eastAsia="Calibri" w:hAnsi="Calibri" w:cs="Calibri"/>
-                                    <w:color w:val="585858"/>
-                                    <w:sz w:val="18"/>
-                                  </w:rPr>
-                                  <w:t>MENINGKAT</w:t>
-                                </w:r>
-                              </w:p>
-                            </w:txbxContent>
-                          </wps:txbx>
-                          <wps:bodyPr spcFirstLastPara="1" wrap="square" lIns="0" tIns="0" rIns="0" bIns="0" anchor="t" anchorCtr="0">
-                            <a:noAutofit/>
-                          </wps:bodyPr>
-                        </wps:wsp>
-                        <wps:wsp>
-                          <wps:cNvPr id="2056861277" name="Rectangle 2056861277"/>
-                          <wps:cNvSpPr/>
-                          <wps:spPr>
-                            <a:xfrm>
-                              <a:off x="5249735" y="864171"/>
-                              <a:ext cx="355600" cy="114300"/>
-                            </a:xfrm>
-                            <a:prstGeom prst="rect">
-                              <a:avLst/>
-                            </a:prstGeom>
-                            <a:noFill/>
-                            <a:ln>
-                              <a:noFill/>
-                            </a:ln>
-                          </wps:spPr>
-                          <wps:txbx>
-                            <w:txbxContent>
-                              <w:p>
-                                <w:pPr>
-                                  <w:spacing w:line="180" w:lineRule="auto"/>
-                                  <w:textDirection w:val="btLr"/>
-                                </w:pPr>
-                                <w:r>
-                                  <w:rPr>
-                                    <w:rFonts w:ascii="Calibri" w:eastAsia="Calibri" w:hAnsi="Calibri" w:cs="Calibri"/>
-                                    <w:color w:val="404040"/>
-                                    <w:sz w:val="18"/>
-                                  </w:rPr>
-                                  <w:t>65.63%</w:t>
-                                </w:r>
-                              </w:p>
-                            </w:txbxContent>
-                          </wps:txbx>
-                          <wps:bodyPr spcFirstLastPara="1" wrap="square" lIns="0" tIns="0" rIns="0" bIns="0" anchor="t" anchorCtr="0">
-                            <a:noAutofit/>
-                          </wps:bodyPr>
-                        </wps:wsp>
-                        <wps:wsp>
-                          <wps:cNvPr id="1396322967" name="Rectangle 1396322967"/>
-                          <wps:cNvSpPr/>
-                          <wps:spPr>
-                            <a:xfrm>
-                              <a:off x="87363" y="1147635"/>
-                              <a:ext cx="1013460" cy="114300"/>
-                            </a:xfrm>
-                            <a:prstGeom prst="rect">
-                              <a:avLst/>
-                            </a:prstGeom>
-                            <a:noFill/>
-                            <a:ln>
-                              <a:noFill/>
-                            </a:ln>
-                          </wps:spPr>
-                          <wps:txbx>
-                            <w:txbxContent>
-                              <w:p>
-                                <w:pPr>
-                                  <w:spacing w:line="180" w:lineRule="auto"/>
-                                  <w:textDirection w:val="btLr"/>
-                                </w:pPr>
-                                <w:r>
-                                  <w:rPr>
-                                    <w:rFonts w:ascii="Calibri" w:eastAsia="Calibri" w:hAnsi="Calibri" w:cs="Calibri"/>
-                                    <w:color w:val="585858"/>
-                                    <w:sz w:val="18"/>
-                                  </w:rPr>
-                                  <w:t>TIADA PENINGKATAN</w:t>
-                                </w:r>
-                              </w:p>
-                            </w:txbxContent>
-                          </wps:txbx>
-                          <wps:bodyPr spcFirstLastPara="1" wrap="square" lIns="0" tIns="0" rIns="0" bIns="0" anchor="t" anchorCtr="0">
-                            <a:noAutofit/>
-                          </wps:bodyPr>
-                        </wps:wsp>
-                        <wps:wsp>
-                          <wps:cNvPr id="354636522" name="Rectangle 354636522"/>
-                          <wps:cNvSpPr/>
-                          <wps:spPr>
-                            <a:xfrm>
-                              <a:off x="2025332" y="1154112"/>
-                              <a:ext cx="355600" cy="114300"/>
-                            </a:xfrm>
-                            <a:prstGeom prst="rect">
-                              <a:avLst/>
-                            </a:prstGeom>
-                            <a:noFill/>
-                            <a:ln>
-                              <a:noFill/>
-                            </a:ln>
-                          </wps:spPr>
-                          <wps:txbx>
-                            <w:txbxContent>
-                              <w:p>
-                                <w:pPr>
-                                  <w:spacing w:line="180" w:lineRule="auto"/>
-                                  <w:textDirection w:val="btLr"/>
-                                </w:pPr>
-                                <w:r>
-                                  <w:rPr>
-                                    <w:rFonts w:ascii="Calibri" w:eastAsia="Calibri" w:hAnsi="Calibri" w:cs="Calibri"/>
-                                    <w:color w:val="404040"/>
-                                    <w:sz w:val="18"/>
-                                  </w:rPr>
-                                  <w:t>12.50%</w:t>
-                                </w:r>
-                              </w:p>
-                            </w:txbxContent>
-                          </wps:txbx>
-                          <wps:bodyPr spcFirstLastPara="1" wrap="square" lIns="0" tIns="0" rIns="0" bIns="0" anchor="t" anchorCtr="0">
-                            <a:noAutofit/>
-                          </wps:bodyPr>
-                        </wps:wsp>
-                        <wps:wsp>
-                          <wps:cNvPr id="578059356" name="Rectangle 578059356"/>
-                          <wps:cNvSpPr/>
-                          <wps:spPr>
-                            <a:xfrm>
-                              <a:off x="575373" y="1437830"/>
-                              <a:ext cx="522605" cy="114300"/>
-                            </a:xfrm>
-                            <a:prstGeom prst="rect">
-                              <a:avLst/>
-                            </a:prstGeom>
-                            <a:noFill/>
-                            <a:ln>
-                              <a:noFill/>
-                            </a:ln>
-                          </wps:spPr>
-                          <wps:txbx>
-                            <w:txbxContent>
-                              <w:p>
-                                <w:pPr>
-                                  <w:spacing w:line="180" w:lineRule="auto"/>
-                                  <w:textDirection w:val="btLr"/>
-                                </w:pPr>
-                                <w:r>
-                                  <w:rPr>
-                                    <w:rFonts w:ascii="Calibri" w:eastAsia="Calibri" w:hAnsi="Calibri" w:cs="Calibri"/>
-                                    <w:color w:val="585858"/>
-                                    <w:sz w:val="18"/>
-                                  </w:rPr>
-                                  <w:t>MENURUN</w:t>
-                                </w:r>
-                              </w:p>
-                            </w:txbxContent>
-                          </wps:txbx>
-                          <wps:bodyPr spcFirstLastPara="1" wrap="square" lIns="0" tIns="0" rIns="0" bIns="0" anchor="t" anchorCtr="0">
-                            <a:noAutofit/>
-                          </wps:bodyPr>
-                        </wps:wsp>
-                        <wps:wsp>
-                          <wps:cNvPr id="905332179" name="Rectangle 905332179"/>
-                          <wps:cNvSpPr/>
-                          <wps:spPr>
-                            <a:xfrm>
-                              <a:off x="2214816" y="1444180"/>
-                              <a:ext cx="355600" cy="114300"/>
-                            </a:xfrm>
-                            <a:prstGeom prst="rect">
-                              <a:avLst/>
-                            </a:prstGeom>
-                            <a:noFill/>
-                            <a:ln>
-                              <a:noFill/>
-                            </a:ln>
-                          </wps:spPr>
-                          <wps:txbx>
-                            <w:txbxContent>
-                              <w:p>
-                                <w:pPr>
-                                  <w:spacing w:line="180" w:lineRule="auto"/>
-                                  <w:textDirection w:val="btLr"/>
-                                </w:pPr>
-                                <w:r>
-                                  <w:rPr>
-                                    <w:rFonts w:ascii="Calibri" w:eastAsia="Calibri" w:hAnsi="Calibri" w:cs="Calibri"/>
-                                    <w:color w:val="404040"/>
-                                    <w:sz w:val="18"/>
-                                  </w:rPr>
-                                  <w:t>15.63%</w:t>
-                                </w:r>
-                              </w:p>
-                            </w:txbxContent>
-                          </wps:txbx>
-                          <wps:bodyPr spcFirstLastPara="1" wrap="square" lIns="0" tIns="0" rIns="0" bIns="0" anchor="t" anchorCtr="0">
-                            <a:noAutofit/>
-                          </wps:bodyPr>
-                        </wps:wsp>
-                        <wps:wsp>
-                          <wps:cNvPr id="657185653" name="Rectangle 657185653"/>
-                          <wps:cNvSpPr/>
-                          <wps:spPr>
-                            <a:xfrm>
-                              <a:off x="1049337" y="1731708"/>
-                              <a:ext cx="297180" cy="114300"/>
-                            </a:xfrm>
-                            <a:prstGeom prst="rect">
-                              <a:avLst/>
-                            </a:prstGeom>
-                            <a:noFill/>
-                            <a:ln>
-                              <a:noFill/>
-                            </a:ln>
-                          </wps:spPr>
-                          <wps:txbx>
-                            <w:txbxContent>
-                              <w:p>
-                                <w:pPr>
-                                  <w:spacing w:line="180" w:lineRule="auto"/>
-                                  <w:textDirection w:val="btLr"/>
-                                </w:pPr>
-                                <w:r>
-                                  <w:rPr>
-                                    <w:rFonts w:ascii="Calibri" w:eastAsia="Calibri" w:hAnsi="Calibri" w:cs="Calibri"/>
-                                    <w:color w:val="585858"/>
-                                    <w:sz w:val="18"/>
-                                  </w:rPr>
-                                  <w:t>0.00%</w:t>
-                                </w:r>
-                              </w:p>
-                            </w:txbxContent>
-                          </wps:txbx>
-                          <wps:bodyPr spcFirstLastPara="1" wrap="square" lIns="0" tIns="0" rIns="0" bIns="0" anchor="t" anchorCtr="0">
-                            <a:noAutofit/>
-                          </wps:bodyPr>
-                        </wps:wsp>
-                        <wps:wsp>
-                          <wps:cNvPr id="852127365" name="Rectangle 852127365"/>
-                          <wps:cNvSpPr/>
-                          <wps:spPr>
-                            <a:xfrm>
-                              <a:off x="1627187" y="1731708"/>
-                              <a:ext cx="355600" cy="114300"/>
-                            </a:xfrm>
-                            <a:prstGeom prst="rect">
-                              <a:avLst/>
-                            </a:prstGeom>
-                            <a:noFill/>
-                            <a:ln>
-                              <a:noFill/>
-                            </a:ln>
-                          </wps:spPr>
-                          <wps:txbx>
-                            <w:txbxContent>
-                              <w:p>
-                                <w:pPr>
-                                  <w:spacing w:line="180" w:lineRule="auto"/>
-                                  <w:textDirection w:val="btLr"/>
-                                </w:pPr>
-                                <w:r>
-                                  <w:rPr>
-                                    <w:rFonts w:ascii="Calibri" w:eastAsia="Calibri" w:hAnsi="Calibri" w:cs="Calibri"/>
-                                    <w:color w:val="585858"/>
-                                    <w:sz w:val="18"/>
-                                  </w:rPr>
-                                  <w:t>10.00%</w:t>
-                                </w:r>
-                              </w:p>
-                            </w:txbxContent>
-                          </wps:txbx>
-                          <wps:bodyPr spcFirstLastPara="1" wrap="square" lIns="0" tIns="0" rIns="0" bIns="0" anchor="t" anchorCtr="0">
-                            <a:noAutofit/>
-                          </wps:bodyPr>
-                        </wps:wsp>
-                        <wps:wsp>
-                          <wps:cNvPr id="1108940974" name="Rectangle 1108940974"/>
-                          <wps:cNvSpPr/>
-                          <wps:spPr>
-                            <a:xfrm>
-                              <a:off x="2234120" y="1731708"/>
-                              <a:ext cx="355600" cy="114300"/>
-                            </a:xfrm>
-                            <a:prstGeom prst="rect">
-                              <a:avLst/>
-                            </a:prstGeom>
-                            <a:noFill/>
-                            <a:ln>
-                              <a:noFill/>
-                            </a:ln>
-                          </wps:spPr>
-                          <wps:txbx>
-                            <w:txbxContent>
-                              <w:p>
-                                <w:pPr>
-                                  <w:spacing w:line="180" w:lineRule="auto"/>
-                                  <w:textDirection w:val="btLr"/>
-                                </w:pPr>
-                                <w:r>
-                                  <w:rPr>
-                                    <w:rFonts w:ascii="Calibri" w:eastAsia="Calibri" w:hAnsi="Calibri" w:cs="Calibri"/>
-                                    <w:color w:val="585858"/>
-                                    <w:sz w:val="18"/>
-                                  </w:rPr>
-                                  <w:t>20.00%</w:t>
-                                </w:r>
-                              </w:p>
-                            </w:txbxContent>
-                          </wps:txbx>
-                          <wps:bodyPr spcFirstLastPara="1" wrap="square" lIns="0" tIns="0" rIns="0" bIns="0" anchor="t" anchorCtr="0">
-                            <a:noAutofit/>
-                          </wps:bodyPr>
-                        </wps:wsp>
-                        <wps:wsp>
-                          <wps:cNvPr id="246300954" name="Rectangle 246300954"/>
-                          <wps:cNvSpPr/>
-                          <wps:spPr>
-                            <a:xfrm>
-                              <a:off x="2840926" y="1731708"/>
-                              <a:ext cx="355600" cy="114300"/>
-                            </a:xfrm>
-                            <a:prstGeom prst="rect">
-                              <a:avLst/>
-                            </a:prstGeom>
-                            <a:noFill/>
-                            <a:ln>
-                              <a:noFill/>
-                            </a:ln>
-                          </wps:spPr>
-                          <wps:txbx>
-                            <w:txbxContent>
-                              <w:p>
-                                <w:pPr>
-                                  <w:spacing w:line="180" w:lineRule="auto"/>
-                                  <w:textDirection w:val="btLr"/>
-                                </w:pPr>
-                                <w:r>
-                                  <w:rPr>
-                                    <w:rFonts w:ascii="Calibri" w:eastAsia="Calibri" w:hAnsi="Calibri" w:cs="Calibri"/>
-                                    <w:color w:val="585858"/>
-                                    <w:sz w:val="18"/>
-                                  </w:rPr>
-                                  <w:t>30.00%</w:t>
-                                </w:r>
-                              </w:p>
-                            </w:txbxContent>
-                          </wps:txbx>
-                          <wps:bodyPr spcFirstLastPara="1" wrap="square" lIns="0" tIns="0" rIns="0" bIns="0" anchor="t" anchorCtr="0">
-                            <a:noAutofit/>
-                          </wps:bodyPr>
-                        </wps:wsp>
-                        <wps:wsp>
-                          <wps:cNvPr id="94021609" name="Rectangle 94021609"/>
-                          <wps:cNvSpPr/>
-                          <wps:spPr>
-                            <a:xfrm>
-                              <a:off x="3448113" y="1731708"/>
-                              <a:ext cx="355600" cy="114300"/>
-                            </a:xfrm>
-                            <a:prstGeom prst="rect">
-                              <a:avLst/>
-                            </a:prstGeom>
-                            <a:noFill/>
-                            <a:ln>
-                              <a:noFill/>
-                            </a:ln>
-                          </wps:spPr>
-                          <wps:txbx>
-                            <w:txbxContent>
-                              <w:p>
-                                <w:pPr>
-                                  <w:spacing w:line="180" w:lineRule="auto"/>
-                                  <w:textDirection w:val="btLr"/>
-                                </w:pPr>
-                                <w:r>
-                                  <w:rPr>
-                                    <w:rFonts w:ascii="Calibri" w:eastAsia="Calibri" w:hAnsi="Calibri" w:cs="Calibri"/>
-                                    <w:color w:val="585858"/>
-                                    <w:sz w:val="18"/>
-                                  </w:rPr>
-                                  <w:t>40.00%</w:t>
-                                </w:r>
-                              </w:p>
-                            </w:txbxContent>
-                          </wps:txbx>
-                          <wps:bodyPr spcFirstLastPara="1" wrap="square" lIns="0" tIns="0" rIns="0" bIns="0" anchor="t" anchorCtr="0">
-                            <a:noAutofit/>
-                          </wps:bodyPr>
-                        </wps:wsp>
-                        <wps:wsp>
-                          <wps:cNvPr id="469712211" name="Rectangle 469712211"/>
-                          <wps:cNvSpPr/>
-                          <wps:spPr>
-                            <a:xfrm>
-                              <a:off x="4054919" y="1731708"/>
-                              <a:ext cx="355600" cy="114300"/>
-                            </a:xfrm>
-                            <a:prstGeom prst="rect">
-                              <a:avLst/>
-                            </a:prstGeom>
-                            <a:noFill/>
-                            <a:ln>
-                              <a:noFill/>
-                            </a:ln>
-                          </wps:spPr>
-                          <wps:txbx>
-                            <w:txbxContent>
-                              <w:p>
-                                <w:pPr>
-                                  <w:spacing w:line="180" w:lineRule="auto"/>
-                                  <w:textDirection w:val="btLr"/>
-                                </w:pPr>
-                                <w:r>
-                                  <w:rPr>
-                                    <w:rFonts w:ascii="Calibri" w:eastAsia="Calibri" w:hAnsi="Calibri" w:cs="Calibri"/>
-                                    <w:color w:val="585858"/>
-                                    <w:sz w:val="18"/>
-                                  </w:rPr>
-                                  <w:t>50.00%</w:t>
-                                </w:r>
-                              </w:p>
-                            </w:txbxContent>
-                          </wps:txbx>
-                          <wps:bodyPr spcFirstLastPara="1" wrap="square" lIns="0" tIns="0" rIns="0" bIns="0" anchor="t" anchorCtr="0">
-                            <a:noAutofit/>
-                          </wps:bodyPr>
-                        </wps:wsp>
-                        <wps:wsp>
-                          <wps:cNvPr id="1113806618" name="Rectangle 1113806618"/>
-                          <wps:cNvSpPr/>
-                          <wps:spPr>
-                            <a:xfrm>
-                              <a:off x="4661852" y="1731708"/>
-                              <a:ext cx="355600" cy="114300"/>
-                            </a:xfrm>
-                            <a:prstGeom prst="rect">
-                              <a:avLst/>
-                            </a:prstGeom>
-                            <a:noFill/>
-                            <a:ln>
-                              <a:noFill/>
-                            </a:ln>
-                          </wps:spPr>
-                          <wps:txbx>
-                            <w:txbxContent>
-                              <w:p>
-                                <w:pPr>
-                                  <w:spacing w:line="180" w:lineRule="auto"/>
-                                  <w:textDirection w:val="btLr"/>
-                                </w:pPr>
-                                <w:r>
-                                  <w:rPr>
-                                    <w:rFonts w:ascii="Calibri" w:eastAsia="Calibri" w:hAnsi="Calibri" w:cs="Calibri"/>
-                                    <w:color w:val="585858"/>
-                                    <w:sz w:val="18"/>
-                                  </w:rPr>
-                                  <w:t>60.00%</w:t>
-                                </w:r>
-                              </w:p>
-                            </w:txbxContent>
-                          </wps:txbx>
-                          <wps:bodyPr spcFirstLastPara="1" wrap="square" lIns="0" tIns="0" rIns="0" bIns="0" anchor="t" anchorCtr="0">
-                            <a:noAutofit/>
-                          </wps:bodyPr>
-                        </wps:wsp>
-                        <wps:wsp>
-                          <wps:cNvPr id="684387652" name="Rectangle 684387652"/>
-                          <wps:cNvSpPr/>
-                          <wps:spPr>
-                            <a:xfrm>
-                              <a:off x="5268912" y="1731708"/>
-                              <a:ext cx="355600" cy="114300"/>
-                            </a:xfrm>
-                            <a:prstGeom prst="rect">
-                              <a:avLst/>
-                            </a:prstGeom>
-                            <a:noFill/>
-                            <a:ln>
-                              <a:noFill/>
-                            </a:ln>
-                          </wps:spPr>
-                          <wps:txbx>
-                            <w:txbxContent>
-                              <w:p>
-                                <w:pPr>
-                                  <w:spacing w:line="180" w:lineRule="auto"/>
-                                  <w:textDirection w:val="btLr"/>
-                                </w:pPr>
-                                <w:r>
-                                  <w:rPr>
-                                    <w:rFonts w:ascii="Calibri" w:eastAsia="Calibri" w:hAnsi="Calibri" w:cs="Calibri"/>
-                                    <w:color w:val="585858"/>
-                                    <w:sz w:val="18"/>
-                                  </w:rPr>
-                                  <w:t>70.00%</w:t>
-                                </w:r>
-                              </w:p>
-                            </w:txbxContent>
-                          </wps:txbx>
-                          <wps:bodyPr spcFirstLastPara="1" wrap="square" lIns="0" tIns="0" rIns="0" bIns="0" anchor="t" anchorCtr="0">
-                            <a:noAutofit/>
-                          </wps:bodyPr>
-                        </wps:wsp>
-                        <wps:wsp>
-                          <wps:cNvPr id="1319656699" name="Rectangle 1319656699"/>
-                          <wps:cNvSpPr/>
-                          <wps:spPr>
-                            <a:xfrm>
-                              <a:off x="2732976" y="2458681"/>
-                              <a:ext cx="437515" cy="114935"/>
-                            </a:xfrm>
-                            <a:prstGeom prst="rect">
-                              <a:avLst/>
-                            </a:prstGeom>
-                            <a:noFill/>
-                            <a:ln>
-                              <a:noFill/>
-                            </a:ln>
-                          </wps:spPr>
-                          <wps:txbx>
-                            <w:txbxContent>
-                              <w:p>
-                                <w:pPr>
-                                  <w:spacing w:line="180" w:lineRule="auto"/>
-                                  <w:textDirection w:val="btLr"/>
-                                </w:pPr>
-                                <w:r>
-                                  <w:rPr>
-                                    <w:rFonts w:ascii="Calibri" w:eastAsia="Calibri" w:hAnsi="Calibri" w:cs="Calibri"/>
-                                    <w:color w:val="585858"/>
-                                    <w:sz w:val="18"/>
-                                  </w:rPr>
-                                  <w:t>PERATUS</w:t>
-                                </w:r>
-                              </w:p>
-                            </w:txbxContent>
-                          </wps:txbx>
-                          <wps:bodyPr spcFirstLastPara="1" wrap="square" lIns="0" tIns="0" rIns="0" bIns="0" anchor="t" anchorCtr="0">
-                            <a:noAutofit/>
-                          </wps:bodyPr>
-                        </wps:wsp>
-                      </wpg:grpSp>
-                    </wpg:wgp>
-                  </a:graphicData>
-                </a:graphic>
-              </wp:anchor>
-            </w:drawing>
-          </mc:Choice>
-          <mc:Fallback>
-            <w:pict>
-              <v:group w14:anchorId="523111CB" id="Group 11" o:spid="_x0000_s1048" style="position:absolute;left:0;text-align:left;margin-left:53.6pt;margin-top:103.05pt;width:453.1pt;height:212.6pt;z-index:-251655168;mso-wrap-distance-left:0;mso-wrap-distance-right:0" coordorigin="24688,24299" coordsize="57544,27000" o:gfxdata="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">
-                <v:group id="Group 1220319413" o:spid="_x0000_s1049" style="position:absolute;left:24688;top:24299;width:57543;height:27000" coordsize="57543,27000" o:gfxdata="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">
-                  <v:rect id="Rectangle 1730733413" o:spid="_x0000_s1050" style="position:absolute;width:57543;height:27000;visibility:visible;mso-wrap-style:square;v-text-anchor:middle" o:gfxdata="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" filled="f" stroked="f">
-                    <v:textbox inset="2.53958mm,2.53958mm,2.53958mm,2.53958mm">
-                      <w:txbxContent>
-                        <w:p>
-                          <w:pPr>
-                            <w:textDirection w:val="btLr"/>
-                          </w:pPr>
-                        </w:p>
-                      </w:txbxContent>
-                    </v:textbox>
-                  </v:rect>
-                  <v:shape id="Freeform: Shape 1326562656" o:spid="_x0000_s1051" style="position:absolute;left:17985;top:4758;width:36404;height:11601;visibility:visible;mso-wrap-style:square;v-text-anchor:middle" coordsize="3640454,1160145" o:gfxdata="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" path="m,776478l,963930em,486918l,672846em,l,383286em,1066038r,93980em606551,486918r,673100em606551,r,383286em1213103,486918r,673100em1213103,r,383286em1819655,486918r,673100em1819655,r,383286em2426207,486918r,673100em2426207,r,383286em3032760,486918r,673100em3032760,r,383286em3640328,r,1160018e" filled="f" strokecolor="#d9d9d9">
-                    <v:stroke startarrowwidth="narrow" startarrowlength="short" endarrowwidth="narrow" endarrowlength="short"/>
-                    <v:path arrowok="t" o:extrusionok="f"/>
-                  </v:shape>
-                  <v:shape id="Freeform: Shape 1035940670" o:spid="_x0000_s1052" style="position:absolute;left:11909;top:5695;width:39821;height:9728;visibility:visible;mso-wrap-style:square;v-text-anchor:middle" coordsize="3982085,972819" o:gfxdata="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" path="m378968,l,,,102108r378968,l378968,xem758444,579120l,579120,,682752r758444,l758444,579120xem947420,870204l,870204,,972312r947420,l947420,870204xem3981704,289560l,289560,,393192r3981704,l3981704,289560xe" fillcolor="#ec7c30" stroked="f">
-                    <v:path arrowok="t" o:extrusionok="f"/>
-                  </v:shape>
-                  <v:shape id="Freeform: Shape 171501731" o:spid="_x0000_s1053" style="position:absolute;left:11909;top:4758;width:13;height:11601;visibility:visible;mso-wrap-style:square;v-text-anchor:middle" coordsize="120000,1160145" o:gfxdata="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" path="m,1160018l,e" filled="f" strokecolor="#d9d9d9">
-                    <v:stroke startarrowwidth="narrow" startarrowlength="short" endarrowwidth="narrow" endarrowlength="short"/>
-                    <v:path arrowok="t" o:extrusionok="f"/>
-                  </v:shape>
-                  <v:shape id="Freeform: Shape 710555192" o:spid="_x0000_s1054" style="position:absolute;left:1853;top:21393;width:25210;height:4045;visibility:visible;mso-wrap-style:square;v-text-anchor:middle" coordsize="2520950,404495" o:gfxdata="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" path="m62776,l,,,62776r62776,l62776,xem2520454,341122r-62776,l2457678,403898r62776,l2520454,341122xe" fillcolor="#ec7c30" stroked="f">
-                    <v:path arrowok="t" o:extrusionok="f"/>
-                  </v:shape>
-                  <v:shape id="Freeform: Shape 1759403382" o:spid="_x0000_s1055" style="position:absolute;left:47;top:47;width:57449;height:26905;visibility:visible;mso-wrap-style:square;v-text-anchor:middle" coordsize="5744845,2690495" o:gfxdata="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" path="m,2690494r5744845,l5744845,,,,,2690494xe" filled="f" strokecolor="#d9d9d9">
-                    <v:stroke startarrowwidth="narrow" startarrowlength="short" endarrowwidth="narrow" endarrowlength="short"/>
-                    <v:path arrowok="t" o:extrusionok="f"/>
-                  </v:shape>
-                  <v:rect id="Rectangle 884807560" o:spid="_x0000_s1056" style="position:absolute;left:17804;top:1358;width:22111;height:1784;visibility:visible;mso-wrap-style:square;v-text-anchor:top" o:gfxdata="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" filled="f" stroked="f">
-                    <v:textbox inset="0,0,0,0">
-                      <w:txbxContent>
-                        <w:p>
-                          <w:pPr>
-                            <w:spacing w:line="281" w:lineRule="auto"/>
-                            <w:textDirection w:val="btLr"/>
-                          </w:pPr>
-                          <w:r>
-                            <w:rPr>
-                              <w:rFonts w:ascii="Calibri" w:eastAsia="Calibri" w:hAnsi="Calibri" w:cs="Calibri"/>
-                              <w:color w:val="585858"/>
-                              <w:sz w:val="28"/>
-                            </w:rPr>
-                            <w:t>PERATUSAN SKOR PRA &amp; POST</w:t>
-                          </w:r>
-                        </w:p>
-                      </w:txbxContent>
-                    </v:textbox>
-                  </v:rect>
-                  <v:rect id="Rectangle 1592117263" o:spid="_x0000_s1057" style="position:absolute;left:3446;top:5676;width:7524;height:1143;visibility:visible;mso-wrap-style:square;v-text-anchor:top" o:gfxdata="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" filled="f" stroked="f">
-                    <v:textbox inset="0,0,0,0">
-                      <w:txbxContent>
-                        <w:p>
-                          <w:pPr>
-                            <w:spacing w:line="180" w:lineRule="auto"/>
-                            <w:textDirection w:val="btLr"/>
-                          </w:pPr>
-                          <w:r>
-                            <w:rPr>
-                              <w:rFonts w:ascii="Calibri" w:eastAsia="Calibri" w:hAnsi="Calibri" w:cs="Calibri"/>
-                              <w:color w:val="585858"/>
-                              <w:sz w:val="18"/>
-                            </w:rPr>
-                            <w:t>TIDAK LENGKAP</w:t>
-                          </w:r>
-                        </w:p>
-                      </w:txbxContent>
-                    </v:textbox>
-                  </v:rect>
-                  <v:rect id="Rectangle 1284594386" o:spid="_x0000_s1058" style="position:absolute;left:16458;top:5739;width:2972;height:1143;visibility:visible;mso-wrap-style:square;v-text-anchor:top" o:gfxdata="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" filled="f" stroked="f">
-                    <v:textbox inset="0,0,0,0">
-                      <w:txbxContent>
-                        <w:p>
-                          <w:pPr>
-                            <w:spacing w:line="180" w:lineRule="auto"/>
-                            <w:textDirection w:val="btLr"/>
-                          </w:pPr>
-                          <w:r>
-                            <w:rPr>
-                              <w:rFonts w:ascii="Calibri" w:eastAsia="Calibri" w:hAnsi="Calibri" w:cs="Calibri"/>
-                              <w:color w:val="404040"/>
-                              <w:sz w:val="18"/>
-                            </w:rPr>
-                            <w:t>6.25%</w:t>
-                          </w:r>
-                        </w:p>
-                      </w:txbxContent>
-                    </v:textbox>
-                  </v:rect>
-                  <v:rect id="Rectangle 350576295" o:spid="_x0000_s1059" style="position:absolute;left:5018;top:8578;width:5956;height:1143;visibility:visible;mso-wrap-style:square;v-text-anchor:top" o:gfxdata="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" filled="f" stroked="f">
-                    <v:textbox inset="0,0,0,0">
-                      <w:txbxContent>
-                        <w:p>
-                          <w:pPr>
-                            <w:spacing w:line="180" w:lineRule="auto"/>
-                            <w:textDirection w:val="btLr"/>
-                          </w:pPr>
-                          <w:r>
-                            <w:rPr>
-                              <w:rFonts w:ascii="Calibri" w:eastAsia="Calibri" w:hAnsi="Calibri" w:cs="Calibri"/>
-                              <w:color w:val="585858"/>
-                              <w:sz w:val="18"/>
-                            </w:rPr>
-                            <w:t>MENINGKAT</w:t>
-                          </w:r>
-                        </w:p>
-                      </w:txbxContent>
-                    </v:textbox>
-                  </v:rect>
-                  <v:rect id="Rectangle 2056861277" o:spid="_x0000_s1060" style="position:absolute;left:52497;top:8641;width:3556;height:1143;visibility:visible;mso-wrap-style:square;v-text-anchor:top" o:gfxdata="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" filled="f" stroked="f">
-                    <v:textbox inset="0,0,0,0">
-                      <w:txbxContent>
-                        <w:p>
-                          <w:pPr>
-                            <w:spacing w:line="180" w:lineRule="auto"/>
-                            <w:textDirection w:val="btLr"/>
-                          </w:pPr>
-                          <w:r>
-                            <w:rPr>
-                              <w:rFonts w:ascii="Calibri" w:eastAsia="Calibri" w:hAnsi="Calibri" w:cs="Calibri"/>
-                              <w:color w:val="404040"/>
-                              <w:sz w:val="18"/>
-                            </w:rPr>
-                            <w:t>65.63%</w:t>
-                          </w:r>
-                        </w:p>
-                      </w:txbxContent>
-                    </v:textbox>
-                  </v:rect>
-                  <v:rect id="Rectangle 1396322967" o:spid="_x0000_s1061" style="position:absolute;left:873;top:11476;width:10135;height:1143;visibility:visible;mso-wrap-style:square;v-text-anchor:top" o:gfxdata="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" filled="f" stroked="f">
-                    <v:textbox inset="0,0,0,0">
-                      <w:txbxContent>
-                        <w:p>
-                          <w:pPr>
-                            <w:spacing w:line="180" w:lineRule="auto"/>
-                            <w:textDirection w:val="btLr"/>
-                          </w:pPr>
-                          <w:r>
-                            <w:rPr>
-                              <w:rFonts w:ascii="Calibri" w:eastAsia="Calibri" w:hAnsi="Calibri" w:cs="Calibri"/>
-                              <w:color w:val="585858"/>
-                              <w:sz w:val="18"/>
-                            </w:rPr>
-                            <w:t>TIADA PENINGKATAN</w:t>
-                          </w:r>
-                        </w:p>
-                      </w:txbxContent>
-                    </v:textbox>
-                  </v:rect>
-                  <v:rect id="Rectangle 354636522" o:spid="_x0000_s1062" style="position:absolute;left:20253;top:11541;width:3556;height:1143;visibility:visible;mso-wrap-style:square;v-text-anchor:top" o:gfxdata="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" filled="f" stroked="f">
-                    <v:textbox inset="0,0,0,0">
-                      <w:txbxContent>
-                        <w:p>
-                          <w:pPr>
-                            <w:spacing w:line="180" w:lineRule="auto"/>
-                            <w:textDirection w:val="btLr"/>
-                          </w:pPr>
-                          <w:r>
-                            <w:rPr>
-                              <w:rFonts w:ascii="Calibri" w:eastAsia="Calibri" w:hAnsi="Calibri" w:cs="Calibri"/>
-                              <w:color w:val="404040"/>
-                              <w:sz w:val="18"/>
-                            </w:rPr>
-                            <w:t>12.50%</w:t>
-                          </w:r>
-                        </w:p>
-                      </w:txbxContent>
-                    </v:textbox>
-                  </v:rect>
-                  <v:rect id="Rectangle 578059356" o:spid="_x0000_s1063" style="position:absolute;left:5753;top:14378;width:5226;height:1143;visibility:visible;mso-wrap-style:square;v-text-anchor:top" o:gfxdata="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" filled="f" stroked="f">
-                    <v:textbox inset="0,0,0,0">
-                      <w:txbxContent>
-                        <w:p>
-                          <w:pPr>
-                            <w:spacing w:line="180" w:lineRule="auto"/>
-                            <w:textDirection w:val="btLr"/>
-                          </w:pPr>
-                          <w:r>
-                            <w:rPr>
-                              <w:rFonts w:ascii="Calibri" w:eastAsia="Calibri" w:hAnsi="Calibri" w:cs="Calibri"/>
-                              <w:color w:val="585858"/>
-                              <w:sz w:val="18"/>
-                            </w:rPr>
-                            <w:t>MENURUN</w:t>
-                          </w:r>
-                        </w:p>
-                      </w:txbxContent>
-                    </v:textbox>
-                  </v:rect>
-                  <v:rect id="Rectangle 905332179" o:spid="_x0000_s1064" style="position:absolute;left:22148;top:14441;width:3556;height:1143;visibility:visible;mso-wrap-style:square;v-text-anchor:top" o:gfxdata="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" filled="f" stroked="f">
-                    <v:textbox inset="0,0,0,0">
-                      <w:txbxContent>
-                        <w:p>
-                          <w:pPr>
-                            <w:spacing w:line="180" w:lineRule="auto"/>
-                            <w:textDirection w:val="btLr"/>
-                          </w:pPr>
-                          <w:r>
-                            <w:rPr>
-                              <w:rFonts w:ascii="Calibri" w:eastAsia="Calibri" w:hAnsi="Calibri" w:cs="Calibri"/>
-                              <w:color w:val="404040"/>
-                              <w:sz w:val="18"/>
-                            </w:rPr>
-                            <w:t>15.63%</w:t>
-                          </w:r>
-                        </w:p>
-                      </w:txbxContent>
-                    </v:textbox>
-                  </v:rect>
-                  <v:rect id="Rectangle 657185653" o:spid="_x0000_s1065" style="position:absolute;left:10493;top:17317;width:2972;height:1143;visibility:visible;mso-wrap-style:square;v-text-anchor:top" o:gfxdata="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" filled="f" stroked="f">
-                    <v:textbox inset="0,0,0,0">
-                      <w:txbxContent>
-                        <w:p>
-                          <w:pPr>
-                            <w:spacing w:line="180" w:lineRule="auto"/>
-                            <w:textDirection w:val="btLr"/>
-                          </w:pPr>
-                          <w:r>
-                            <w:rPr>
-                              <w:rFonts w:ascii="Calibri" w:eastAsia="Calibri" w:hAnsi="Calibri" w:cs="Calibri"/>
-                              <w:color w:val="585858"/>
-                              <w:sz w:val="18"/>
-                            </w:rPr>
-                            <w:t>0.00%</w:t>
-                          </w:r>
-                        </w:p>
-                      </w:txbxContent>
-                    </v:textbox>
-                  </v:rect>
-                  <v:rect id="Rectangle 852127365" o:spid="_x0000_s1066" style="position:absolute;left:16271;top:17317;width:3556;height:1143;visibility:visible;mso-wrap-style:square;v-text-anchor:top" o:gfxdata="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" filled="f" stroked="f">
-                    <v:textbox inset="0,0,0,0">
-                      <w:txbxContent>
-                        <w:p>
-                          <w:pPr>
-                            <w:spacing w:line="180" w:lineRule="auto"/>
-                            <w:textDirection w:val="btLr"/>
-                          </w:pPr>
-                          <w:r>
-                            <w:rPr>
-                              <w:rFonts w:ascii="Calibri" w:eastAsia="Calibri" w:hAnsi="Calibri" w:cs="Calibri"/>
-                              <w:color w:val="585858"/>
-                              <w:sz w:val="18"/>
-                            </w:rPr>
-                            <w:t>10.00%</w:t>
-                          </w:r>
-                        </w:p>
-                      </w:txbxContent>
-                    </v:textbox>
-                  </v:rect>
-                  <v:rect id="Rectangle 1108940974" o:spid="_x0000_s1067" style="position:absolute;left:22341;top:17317;width:3556;height:1143;visibility:visible;mso-wrap-style:square;v-text-anchor:top" o:gfxdata="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" filled="f" stroked="f">
-                    <v:textbox inset="0,0,0,0">
-                      <w:txbxContent>
-                        <w:p>
-                          <w:pPr>
-                            <w:spacing w:line="180" w:lineRule="auto"/>
-                            <w:textDirection w:val="btLr"/>
-                          </w:pPr>
-                          <w:r>
-                            <w:rPr>
-                              <w:rFonts w:ascii="Calibri" w:eastAsia="Calibri" w:hAnsi="Calibri" w:cs="Calibri"/>
-                              <w:color w:val="585858"/>
-                              <w:sz w:val="18"/>
-                            </w:rPr>
-                            <w:t>20.00%</w:t>
-                          </w:r>
-                        </w:p>
-                      </w:txbxContent>
-                    </v:textbox>
-                  </v:rect>
-                  <v:rect id="Rectangle 246300954" o:spid="_x0000_s1068" style="position:absolute;left:28409;top:17317;width:3556;height:1143;visibility:visible;mso-wrap-style:square;v-text-anchor:top" o:gfxdata="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" filled="f" stroked="f">
-                    <v:textbox inset="0,0,0,0">
-                      <w:txbxContent>
-                        <w:p>
-                          <w:pPr>
-                            <w:spacing w:line="180" w:lineRule="auto"/>
-                            <w:textDirection w:val="btLr"/>
-                          </w:pPr>
-                          <w:r>
-                            <w:rPr>
-                              <w:rFonts w:ascii="Calibri" w:eastAsia="Calibri" w:hAnsi="Calibri" w:cs="Calibri"/>
-                              <w:color w:val="585858"/>
-                              <w:sz w:val="18"/>
-                            </w:rPr>
-                            <w:t>30.00%</w:t>
-                          </w:r>
-                        </w:p>
-                      </w:txbxContent>
-                    </v:textbox>
-                  </v:rect>
-                  <v:rect id="Rectangle 94021609" o:spid="_x0000_s1069" style="position:absolute;left:34481;top:17317;width:3556;height:1143;visibility:visible;mso-wrap-style:square;v-text-anchor:top" o:gfxdata="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" filled="f" stroked="f">
-                    <v:textbox inset="0,0,0,0">
-                      <w:txbxContent>
-                        <w:p>
-                          <w:pPr>
-                            <w:spacing w:line="180" w:lineRule="auto"/>
-                            <w:textDirection w:val="btLr"/>
-                          </w:pPr>
-                          <w:r>
-                            <w:rPr>
-                              <w:rFonts w:ascii="Calibri" w:eastAsia="Calibri" w:hAnsi="Calibri" w:cs="Calibri"/>
-                              <w:color w:val="585858"/>
-                              <w:sz w:val="18"/>
-                            </w:rPr>
-                            <w:t>40.00%</w:t>
-                          </w:r>
-                        </w:p>
-                      </w:txbxContent>
-                    </v:textbox>
-                  </v:rect>
-                  <v:rect id="Rectangle 469712211" o:spid="_x0000_s1070" style="position:absolute;left:40549;top:17317;width:3556;height:1143;visibility:visible;mso-wrap-style:square;v-text-anchor:top" o:gfxdata="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" filled="f" stroked="f">
-                    <v:textbox inset="0,0,0,0">
-                      <w:txbxContent>
-                        <w:p>
-                          <w:pPr>
-                            <w:spacing w:line="180" w:lineRule="auto"/>
-                            <w:textDirection w:val="btLr"/>
-                          </w:pPr>
-                          <w:r>
-                            <w:rPr>
-                              <w:rFonts w:ascii="Calibri" w:eastAsia="Calibri" w:hAnsi="Calibri" w:cs="Calibri"/>
-                              <w:color w:val="585858"/>
-                              <w:sz w:val="18"/>
-                            </w:rPr>
-                            <w:t>50.00%</w:t>
-                          </w:r>
-                        </w:p>
-                      </w:txbxContent>
-                    </v:textbox>
-                  </v:rect>
-                  <v:rect id="Rectangle 1113806618" o:spid="_x0000_s1071" style="position:absolute;left:46618;top:17317;width:3556;height:1143;visibility:visible;mso-wrap-style:square;v-text-anchor:top" o:gfxdata="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" filled="f" stroked="f">
-                    <v:textbox inset="0,0,0,0">
-                      <w:txbxContent>
-                        <w:p>
-                          <w:pPr>
-                            <w:spacing w:line="180" w:lineRule="auto"/>
-                            <w:textDirection w:val="btLr"/>
-                          </w:pPr>
-                          <w:r>
-                            <w:rPr>
-                              <w:rFonts w:ascii="Calibri" w:eastAsia="Calibri" w:hAnsi="Calibri" w:cs="Calibri"/>
-                              <w:color w:val="585858"/>
-                              <w:sz w:val="18"/>
-                            </w:rPr>
-                            <w:t>60.00%</w:t>
-                          </w:r>
-                        </w:p>
-                      </w:txbxContent>
-                    </v:textbox>
-                  </v:rect>
-                  <v:rect id="Rectangle 684387652" o:spid="_x0000_s1072" style="position:absolute;left:52689;top:17317;width:3556;height:1143;visibility:visible;mso-wrap-style:square;v-text-anchor:top" o:gfxdata="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" filled="f" stroked="f">
-                    <v:textbox inset="0,0,0,0">
-                      <w:txbxContent>
-                        <w:p>
-                          <w:pPr>
-                            <w:spacing w:line="180" w:lineRule="auto"/>
-                            <w:textDirection w:val="btLr"/>
-                          </w:pPr>
-                          <w:r>
-                            <w:rPr>
-                              <w:rFonts w:ascii="Calibri" w:eastAsia="Calibri" w:hAnsi="Calibri" w:cs="Calibri"/>
-                              <w:color w:val="585858"/>
-                              <w:sz w:val="18"/>
-                            </w:rPr>
-                            <w:t>70.00%</w:t>
-                          </w:r>
-                        </w:p>
-                      </w:txbxContent>
-                    </v:textbox>
-                  </v:rect>
-                  <v:rect id="Rectangle 1319656699" o:spid="_x0000_s1073" style="position:absolute;left:27329;top:24586;width:4375;height:1150;visibility:visible;mso-wrap-style:square;v-text-anchor:top" o:gfxdata="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" filled="f" stroked="f">
-                    <v:textbox inset="0,0,0,0">
-                      <w:txbxContent>
-                        <w:p>
-                          <w:pPr>
-                            <w:spacing w:line="180" w:lineRule="auto"/>
-                            <w:textDirection w:val="btLr"/>
-                          </w:pPr>
-                          <w:r>
-                            <w:rPr>
-                              <w:rFonts w:ascii="Calibri" w:eastAsia="Calibri" w:hAnsi="Calibri" w:cs="Calibri"/>
-                              <w:color w:val="585858"/>
-                              <w:sz w:val="18"/>
-                            </w:rPr>
-                            <w:t>PERATUS</w:t>
-                          </w:r>
-                        </w:p>
-                      </w:txbxContent>
-                    </v:textbox>
-                  </v:rect>
-                </v:group>
-              </v:group>
-            </w:pict>
-          </mc:Fallback>
-        </mc:AlternateContent>
-      </w:r>
     </w:p>
     <w:p>
       <w:pPr>
@@ -28831,485 +25657,6 @@
           <w:right w:val="nil"/>
           <w:between w:val="nil"/>
         </w:pBdr>
-        <w:rPr>
-          <w:color w:val="000000"/>
-          <w:sz w:val="20"/>
-          <w:szCs w:val="20"/>
-        </w:rPr>
-      </w:pPr>
-    </w:p>
-    <w:p>
-      <w:pPr>
-        <w:pBdr>
-          <w:top w:val="nil"/>
-          <w:left w:val="nil"/>
-          <w:bottom w:val="nil"/>
-          <w:right w:val="nil"/>
-          <w:between w:val="nil"/>
-        </w:pBdr>
-        <w:rPr>
-          <w:color w:val="000000"/>
-          <w:sz w:val="20"/>
-          <w:szCs w:val="20"/>
-        </w:rPr>
-      </w:pPr>
-    </w:p>
-    <w:p>
-      <w:pPr>
-        <w:pBdr>
-          <w:top w:val="nil"/>
-          <w:left w:val="nil"/>
-          <w:bottom w:val="nil"/>
-          <w:right w:val="nil"/>
-          <w:between w:val="nil"/>
-        </w:pBdr>
-        <w:rPr>
-          <w:color w:val="000000"/>
-          <w:sz w:val="20"/>
-          <w:szCs w:val="20"/>
-        </w:rPr>
-      </w:pPr>
-    </w:p>
-    <w:p>
-      <w:pPr>
-        <w:pBdr>
-          <w:top w:val="nil"/>
-          <w:left w:val="nil"/>
-          <w:bottom w:val="nil"/>
-          <w:right w:val="nil"/>
-          <w:between w:val="nil"/>
-        </w:pBdr>
-        <w:rPr>
-          <w:color w:val="000000"/>
-          <w:sz w:val="20"/>
-          <w:szCs w:val="20"/>
-        </w:rPr>
-      </w:pPr>
-    </w:p>
-    <w:p>
-      <w:pPr>
-        <w:pBdr>
-          <w:top w:val="nil"/>
-          <w:left w:val="nil"/>
-          <w:bottom w:val="nil"/>
-          <w:right w:val="nil"/>
-          <w:between w:val="nil"/>
-        </w:pBdr>
-        <w:rPr>
-          <w:color w:val="000000"/>
-          <w:sz w:val="20"/>
-          <w:szCs w:val="20"/>
-        </w:rPr>
-      </w:pPr>
-    </w:p>
-    <w:p>
-      <w:pPr>
-        <w:pBdr>
-          <w:top w:val="nil"/>
-          <w:left w:val="nil"/>
-          <w:bottom w:val="nil"/>
-          <w:right w:val="nil"/>
-          <w:between w:val="nil"/>
-        </w:pBdr>
-        <w:rPr>
-          <w:color w:val="000000"/>
-          <w:sz w:val="20"/>
-          <w:szCs w:val="20"/>
-        </w:rPr>
-      </w:pPr>
-    </w:p>
-    <w:p>
-      <w:pPr>
-        <w:pBdr>
-          <w:top w:val="nil"/>
-          <w:left w:val="nil"/>
-          <w:bottom w:val="nil"/>
-          <w:right w:val="nil"/>
-          <w:between w:val="nil"/>
-        </w:pBdr>
-        <w:spacing w:before="8"/>
-        <w:rPr>
-          <w:color w:val="000000"/>
-          <w:sz w:val="20"/>
-          <w:szCs w:val="20"/>
-        </w:rPr>
-      </w:pPr>
-    </w:p>
-    <w:tbl>
-      <w:tblPr>
-        <w:tblStyle w:val="af7"/>
-        <w:tblW w:w="8611" w:type="dxa"/>
-        <w:tblInd w:w="1307" w:type="dxa"/>
-        <w:tblBorders>
-          <w:top w:val="single" w:sz="6" w:space="0" w:color="D9D9D9"/>
-          <w:left w:val="single" w:sz="6" w:space="0" w:color="D9D9D9"/>
-          <w:bottom w:val="single" w:sz="6" w:space="0" w:color="D9D9D9"/>
-          <w:right w:val="single" w:sz="6" w:space="0" w:color="D9D9D9"/>
-          <w:insideH w:val="single" w:sz="6" w:space="0" w:color="D9D9D9"/>
-          <w:insideV w:val="single" w:sz="6" w:space="0" w:color="D9D9D9"/>
-        </w:tblBorders>
-        <w:tblLayout w:type="fixed"/>
-        <w:tblLook w:val="0000" w:firstRow="0" w:lastRow="0" w:firstColumn="0" w:lastColumn="0" w:noHBand="0" w:noVBand="0"/>
-      </w:tblPr>
-      <w:tblGrid>
-        <w:gridCol w:w="927"/>
-        <w:gridCol w:w="1921"/>
-        <w:gridCol w:w="1921"/>
-        <w:gridCol w:w="1921"/>
-        <w:gridCol w:w="1921"/>
-      </w:tblGrid>
-      <w:tr>
-        <w:trPr>
-          <w:trHeight w:val="204"/>
-        </w:trPr>
-        <w:tc>
-          <w:tcPr>
-            <w:tcW w:w="927" w:type="dxa"/>
-            <w:tcBorders>
-              <w:top w:val="nil"/>
-              <w:left w:val="nil"/>
-            </w:tcBorders>
-          </w:tcPr>
-          <w:p>
-            <w:pPr>
-              <w:pBdr>
-                <w:top w:val="nil"/>
-                <w:left w:val="nil"/>
-                <w:bottom w:val="nil"/>
-                <w:right w:val="nil"/>
-                <w:between w:val="nil"/>
-              </w:pBdr>
-              <w:rPr>
-                <w:rFonts w:ascii="Times New Roman" w:eastAsia="Times New Roman" w:hAnsi="Times New Roman" w:cs="Times New Roman"/>
-                <w:color w:val="000000"/>
-                <w:sz w:val="14"/>
-                <w:szCs w:val="14"/>
-              </w:rPr>
-            </w:pPr>
-          </w:p>
-        </w:tc>
-        <w:tc>
-          <w:tcPr>
-            <w:tcW w:w="1921" w:type="dxa"/>
-          </w:tcPr>
-          <w:p>
-            <w:pPr>
-              <w:pBdr>
-                <w:top w:val="nil"/>
-                <w:left w:val="nil"/>
-                <w:bottom w:val="nil"/>
-                <w:right w:val="nil"/>
-                <w:between w:val="nil"/>
-              </w:pBdr>
-              <w:spacing w:line="185" w:lineRule="auto"/>
-              <w:ind w:left="16" w:right="1"/>
-              <w:jc w:val="center"/>
-              <w:rPr>
-                <w:rFonts w:ascii="Calibri" w:eastAsia="Calibri" w:hAnsi="Calibri" w:cs="Calibri"/>
-                <w:color w:val="000000"/>
-                <w:sz w:val="18"/>
-                <w:szCs w:val="18"/>
-              </w:rPr>
-            </w:pPr>
-            <w:r>
-              <w:rPr>
-                <w:rFonts w:ascii="Calibri" w:eastAsia="Calibri" w:hAnsi="Calibri" w:cs="Calibri"/>
-                <w:color w:val="585858"/>
-                <w:sz w:val="18"/>
-                <w:szCs w:val="18"/>
-              </w:rPr>
-              <w:t>MENURUN</w:t>
-            </w:r>
-          </w:p>
-        </w:tc>
-        <w:tc>
-          <w:tcPr>
-            <w:tcW w:w="1921" w:type="dxa"/>
-          </w:tcPr>
-          <w:p>
-            <w:pPr>
-              <w:pBdr>
-                <w:top w:val="nil"/>
-                <w:left w:val="nil"/>
-                <w:bottom w:val="nil"/>
-                <w:right w:val="nil"/>
-                <w:between w:val="nil"/>
-              </w:pBdr>
-              <w:spacing w:line="185" w:lineRule="auto"/>
-              <w:ind w:left="16" w:right="5"/>
-              <w:jc w:val="center"/>
-              <w:rPr>
-                <w:rFonts w:ascii="Calibri" w:eastAsia="Calibri" w:hAnsi="Calibri" w:cs="Calibri"/>
-                <w:color w:val="000000"/>
-                <w:sz w:val="18"/>
-                <w:szCs w:val="18"/>
-              </w:rPr>
-            </w:pPr>
-            <w:r>
-              <w:rPr>
-                <w:rFonts w:ascii="Calibri" w:eastAsia="Calibri" w:hAnsi="Calibri" w:cs="Calibri"/>
-                <w:color w:val="585858"/>
-                <w:sz w:val="18"/>
-                <w:szCs w:val="18"/>
-              </w:rPr>
-              <w:t>TIADA PENINGKATAN</w:t>
-            </w:r>
-          </w:p>
-        </w:tc>
-        <w:tc>
-          <w:tcPr>
-            <w:tcW w:w="1921" w:type="dxa"/>
-          </w:tcPr>
-          <w:p>
-            <w:pPr>
-              <w:pBdr>
-                <w:top w:val="nil"/>
-                <w:left w:val="nil"/>
-                <w:bottom w:val="nil"/>
-                <w:right w:val="nil"/>
-                <w:between w:val="nil"/>
-              </w:pBdr>
-              <w:spacing w:line="185" w:lineRule="auto"/>
-              <w:ind w:left="16" w:right="5"/>
-              <w:jc w:val="center"/>
-              <w:rPr>
-                <w:rFonts w:ascii="Calibri" w:eastAsia="Calibri" w:hAnsi="Calibri" w:cs="Calibri"/>
-                <w:color w:val="000000"/>
-                <w:sz w:val="18"/>
-                <w:szCs w:val="18"/>
-              </w:rPr>
-            </w:pPr>
-            <w:r>
-              <w:rPr>
-                <w:rFonts w:ascii="Calibri" w:eastAsia="Calibri" w:hAnsi="Calibri" w:cs="Calibri"/>
-                <w:color w:val="585858"/>
-                <w:sz w:val="18"/>
-                <w:szCs w:val="18"/>
-              </w:rPr>
-              <w:t>MENINGKAT</w:t>
-            </w:r>
-          </w:p>
-        </w:tc>
-        <w:tc>
-          <w:tcPr>
-            <w:tcW w:w="1921" w:type="dxa"/>
-          </w:tcPr>
-          <w:p>
-            <w:pPr>
-              <w:pBdr>
-                <w:top w:val="nil"/>
-                <w:left w:val="nil"/>
-                <w:bottom w:val="nil"/>
-                <w:right w:val="nil"/>
-                <w:between w:val="nil"/>
-              </w:pBdr>
-              <w:spacing w:line="185" w:lineRule="auto"/>
-              <w:ind w:left="16" w:right="7"/>
-              <w:jc w:val="center"/>
-              <w:rPr>
-                <w:rFonts w:ascii="Calibri" w:eastAsia="Calibri" w:hAnsi="Calibri" w:cs="Calibri"/>
-                <w:color w:val="000000"/>
-                <w:sz w:val="18"/>
-                <w:szCs w:val="18"/>
-              </w:rPr>
-            </w:pPr>
-            <w:r>
-              <w:rPr>
-                <w:rFonts w:ascii="Calibri" w:eastAsia="Calibri" w:hAnsi="Calibri" w:cs="Calibri"/>
-                <w:color w:val="585858"/>
-                <w:sz w:val="18"/>
-                <w:szCs w:val="18"/>
-              </w:rPr>
-              <w:t>TIDAK LENGKAP</w:t>
-            </w:r>
-          </w:p>
-        </w:tc>
-      </w:tr>
-      <w:tr>
-        <w:trPr>
-          <w:trHeight w:val="272"/>
-        </w:trPr>
-        <w:tc>
-          <w:tcPr>
-            <w:tcW w:w="927" w:type="dxa"/>
-          </w:tcPr>
-          <w:p>
-            <w:pPr>
-              <w:pBdr>
-                <w:top w:val="nil"/>
-                <w:left w:val="nil"/>
-                <w:bottom w:val="nil"/>
-                <w:right w:val="nil"/>
-                <w:between w:val="nil"/>
-              </w:pBdr>
-              <w:spacing w:before="11"/>
-              <w:ind w:left="205"/>
-              <w:rPr>
-                <w:rFonts w:ascii="Calibri" w:eastAsia="Calibri" w:hAnsi="Calibri" w:cs="Calibri"/>
-                <w:color w:val="000000"/>
-                <w:sz w:val="18"/>
-                <w:szCs w:val="18"/>
-              </w:rPr>
-            </w:pPr>
-            <w:r>
-              <w:rPr>
-                <w:rFonts w:ascii="Calibri" w:eastAsia="Calibri" w:hAnsi="Calibri" w:cs="Calibri"/>
-                <w:color w:val="585858"/>
-                <w:sz w:val="18"/>
-                <w:szCs w:val="18"/>
-              </w:rPr>
-              <w:t>PERATUS</w:t>
-            </w:r>
-          </w:p>
-        </w:tc>
-        <w:tc>
-          <w:tcPr>
-            <w:tcW w:w="1921" w:type="dxa"/>
-          </w:tcPr>
-          <w:p>
-            <w:pPr>
-              <w:pBdr>
-                <w:top w:val="nil"/>
-                <w:left w:val="nil"/>
-                <w:bottom w:val="nil"/>
-                <w:right w:val="nil"/>
-                <w:between w:val="nil"/>
-              </w:pBdr>
-              <w:spacing w:before="16"/>
-              <w:ind w:left="16"/>
-              <w:jc w:val="center"/>
-              <w:rPr>
-                <w:rFonts w:ascii="Calibri" w:eastAsia="Calibri" w:hAnsi="Calibri" w:cs="Calibri"/>
-                <w:color w:val="000000"/>
-                <w:sz w:val="18"/>
-                <w:szCs w:val="18"/>
-              </w:rPr>
-            </w:pPr>
-            <w:r>
-              <w:rPr>
-                <w:rFonts w:ascii="Calibri" w:eastAsia="Calibri" w:hAnsi="Calibri" w:cs="Calibri"/>
-                <w:color w:val="585858"/>
-                <w:sz w:val="18"/>
-                <w:szCs w:val="18"/>
-              </w:rPr>
-              <w:t>15.63%</w:t>
-            </w:r>
-          </w:p>
-        </w:tc>
-        <w:tc>
-          <w:tcPr>
-            <w:tcW w:w="1921" w:type="dxa"/>
-          </w:tcPr>
-          <w:p>
-            <w:pPr>
-              <w:pBdr>
-                <w:top w:val="nil"/>
-                <w:left w:val="nil"/>
-                <w:bottom w:val="nil"/>
-                <w:right w:val="nil"/>
-                <w:between w:val="nil"/>
-              </w:pBdr>
-              <w:spacing w:before="16"/>
-              <w:ind w:left="16" w:right="2"/>
-              <w:jc w:val="center"/>
-              <w:rPr>
-                <w:rFonts w:ascii="Calibri" w:eastAsia="Calibri" w:hAnsi="Calibri" w:cs="Calibri"/>
-                <w:color w:val="000000"/>
-                <w:sz w:val="18"/>
-                <w:szCs w:val="18"/>
-              </w:rPr>
-            </w:pPr>
-            <w:r>
-              <w:rPr>
-                <w:rFonts w:ascii="Calibri" w:eastAsia="Calibri" w:hAnsi="Calibri" w:cs="Calibri"/>
-                <w:color w:val="585858"/>
-                <w:sz w:val="18"/>
-                <w:szCs w:val="18"/>
-              </w:rPr>
-              <w:t>12.50%</w:t>
-            </w:r>
-          </w:p>
-        </w:tc>
-        <w:tc>
-          <w:tcPr>
-            <w:tcW w:w="1921" w:type="dxa"/>
-          </w:tcPr>
-          <w:p>
-            <w:pPr>
-              <w:pBdr>
-                <w:top w:val="nil"/>
-                <w:left w:val="nil"/>
-                <w:bottom w:val="nil"/>
-                <w:right w:val="nil"/>
-                <w:between w:val="nil"/>
-              </w:pBdr>
-              <w:spacing w:before="16"/>
-              <w:ind w:left="16" w:right="4"/>
-              <w:jc w:val="center"/>
-              <w:rPr>
-                <w:rFonts w:ascii="Calibri" w:eastAsia="Calibri" w:hAnsi="Calibri" w:cs="Calibri"/>
-                <w:color w:val="000000"/>
-                <w:sz w:val="18"/>
-                <w:szCs w:val="18"/>
-              </w:rPr>
-            </w:pPr>
-            <w:r>
-              <w:rPr>
-                <w:rFonts w:ascii="Calibri" w:eastAsia="Calibri" w:hAnsi="Calibri" w:cs="Calibri"/>
-                <w:color w:val="585858"/>
-                <w:sz w:val="18"/>
-                <w:szCs w:val="18"/>
-              </w:rPr>
-              <w:t>65.63%</w:t>
-            </w:r>
-          </w:p>
-        </w:tc>
-        <w:tc>
-          <w:tcPr>
-            <w:tcW w:w="1921" w:type="dxa"/>
-          </w:tcPr>
-          <w:p>
-            <w:pPr>
-              <w:pBdr>
-                <w:top w:val="nil"/>
-                <w:left w:val="nil"/>
-                <w:bottom w:val="nil"/>
-                <w:right w:val="nil"/>
-                <w:between w:val="nil"/>
-              </w:pBdr>
-              <w:spacing w:before="16"/>
-              <w:ind w:left="16" w:right="5"/>
-              <w:jc w:val="center"/>
-              <w:rPr>
-                <w:rFonts w:ascii="Calibri" w:eastAsia="Calibri" w:hAnsi="Calibri" w:cs="Calibri"/>
-                <w:color w:val="000000"/>
-                <w:sz w:val="18"/>
-                <w:szCs w:val="18"/>
-              </w:rPr>
-            </w:pPr>
-            <w:r>
-              <w:rPr>
-                <w:rFonts w:ascii="Calibri" w:eastAsia="Calibri" w:hAnsi="Calibri" w:cs="Calibri"/>
-                <w:color w:val="585858"/>
-                <w:sz w:val="18"/>
-                <w:szCs w:val="18"/>
-              </w:rPr>
-              <w:t>6.25%</w:t>
-            </w:r>
-          </w:p>
-        </w:tc>
-      </w:tr>
-    </w:tbl>
-    <w:p>
-      <w:pPr>
-        <w:pBdr>
-          <w:top w:val="nil"/>
-          <w:left w:val="nil"/>
-          <w:bottom w:val="nil"/>
-          <w:right w:val="nil"/>
-          <w:between w:val="nil"/>
-        </w:pBdr>
-        <w:jc w:val="center"/>
         <w:rPr>
           <w:rFonts w:ascii="Calibri" w:eastAsia="Calibri" w:hAnsi="Calibri" w:cs="Calibri"/>
           <w:color w:val="000000"/>
@@ -30054,10 +26401,7 @@
       </w:r>
       <w:proofErr w:type="spellEnd"/>
       <w:r>
-        <w:t>. Terdapat percanggahan skor yang dicapai dengan</w:t>
-      </w:r>
-      <w:r>
-        <w:t xml:space="preserve"> penilaian keseluruhan kursus, rata-rata peserta menyatakan kepentingan kursus ini dan dapat meningkatkan kefahaman mereka dalam konteks </w:t>
+        <w:t xml:space="preserve">. Terdapat percanggahan skor yang dicapai dengan penilaian keseluruhan kursus, rata-rata peserta menyatakan kepentingan kursus ini dan dapat meningkatkan kefahaman mereka dalam konteks </w:t>
       </w:r>
       <w:proofErr w:type="spellStart"/>
       <w:r>

</xml_diff>